<commit_message>
Materiale campo: documento completo, liste cartoni G1-G5 e PDF per la responsabile
- materiale/Materiale_Campo_2026.md: documento unificato per giornata con
  commissioni, rivisto giorno per giorno (dubbi risolti D1-D34)
- materiale/01-04: file intermedi delle sessioni per commissione
- materiale/cartoni/: checklist per cartone G1-G5 + Da_Realizzare + Da_Portare,
  in MD e PDF
- PROMPT_MATERIALE_CAMPO.md: prompt delle sessioni di lavoro
- Aggiornamenti libretti e documenti commissioni; nuovi materiali vari
  (giorno zero, immagini serate, info varie)
- .gitignore per file temporanei Word e .idea

Co-Authored-By: Claude Fable 5 <noreply@anthropic.com>
</commit_message>
<xml_diff>
--- a/materiale commissioni/liturgia/Campo Medie 2026 - Commissione Liturgia.docx
+++ b/materiale commissioni/liturgia/Campo Medie 2026 - Commissione Liturgia.docx
@@ -1,6 +1,6 @@
 
 <file path=word/document.xml><?xml version="1.0" encoding="utf-8"?>
-<w:document xmlns:wpc="http://schemas.microsoft.com/office/word/2010/wordprocessingCanvas" xmlns:cx="http://schemas.microsoft.com/office/drawing/2014/chartex" xmlns:cx1="http://schemas.microsoft.com/office/drawing/2015/9/8/chartex" xmlns:cx2="http://schemas.microsoft.com/office/drawing/2015/10/21/chartex" xmlns:cx3="http://schemas.microsoft.com/office/drawing/2016/5/9/chartex" xmlns:cx4="http://schemas.microsoft.com/office/drawing/2016/5/10/chartex" xmlns:cx5="http://schemas.microsoft.com/office/drawing/2016/5/11/chartex" xmlns:cx6="http://schemas.microsoft.com/office/drawing/2016/5/12/chartex" xmlns:cx7="http://schemas.microsoft.com/office/drawing/2016/5/13/chartex" xmlns:cx8="http://schemas.microsoft.com/office/drawing/2016/5/14/chartex" xmlns:mc="http://schemas.openxmlformats.org/markup-compatibility/2006" xmlns:aink="http://schemas.microsoft.com/office/drawing/2016/ink" xmlns:am3d="http://schemas.microsoft.com/office/drawing/2017/model3d" xmlns:o="urn:schemas-microsoft-com:office:office" xmlns:oel="http://schemas.microsoft.com/office/2019/extlst" xmlns:r="http://schemas.openxmlformats.org/officeDocument/2006/relationships" xmlns:m="http://schemas.openxmlformats.org/officeDocument/2006/math" xmlns:v="urn:schemas-microsoft-com:vml" xmlns:wp14="http://schemas.microsoft.com/office/word/2010/wordprocessingDrawing" xmlns:wp="http://schemas.openxmlformats.org/drawingml/2006/wordprocessingDrawing" xmlns:w10="urn:schemas-microsoft-com:office:word" xmlns:w="http://schemas.openxmlformats.org/wordprocessingml/2006/main" xmlns:w14="http://schemas.microsoft.com/office/word/2010/wordml" xmlns:w15="http://schemas.microsoft.com/office/word/2012/wordml" xmlns:w16cex="http://schemas.microsoft.com/office/word/2018/wordml/cex" xmlns:w16cid="http://schemas.microsoft.com/office/word/2016/wordml/cid" xmlns:w16="http://schemas.microsoft.com/office/word/2018/wordml" xmlns:w16sdtdh="http://schemas.microsoft.com/office/word/2020/wordml/sdtdatahash" xmlns:w16se="http://schemas.microsoft.com/office/word/2015/wordml/symex" xmlns:wpg="http://schemas.microsoft.com/office/word/2010/wordprocessingGroup" xmlns:wpi="http://schemas.microsoft.com/office/word/2010/wordprocessingInk" xmlns:wne="http://schemas.microsoft.com/office/word/2006/wordml" xmlns:wps="http://schemas.microsoft.com/office/word/2010/wordprocessingShape" mc:Ignorable="w14 w15 w16se w16cid w16 w16cex w16sdtdh wp14">
+<w:document xmlns:wpc="http://schemas.microsoft.com/office/word/2010/wordprocessingCanvas" xmlns:cx="http://schemas.microsoft.com/office/drawing/2014/chartex" xmlns:cx1="http://schemas.microsoft.com/office/drawing/2015/9/8/chartex" xmlns:cx2="http://schemas.microsoft.com/office/drawing/2015/10/21/chartex" xmlns:cx3="http://schemas.microsoft.com/office/drawing/2016/5/9/chartex" xmlns:cx4="http://schemas.microsoft.com/office/drawing/2016/5/10/chartex" xmlns:cx5="http://schemas.microsoft.com/office/drawing/2016/5/11/chartex" xmlns:cx6="http://schemas.microsoft.com/office/drawing/2016/5/12/chartex" xmlns:cx7="http://schemas.microsoft.com/office/drawing/2016/5/13/chartex" xmlns:cx8="http://schemas.microsoft.com/office/drawing/2016/5/14/chartex" xmlns:mc="http://schemas.openxmlformats.org/markup-compatibility/2006" xmlns:m="http://schemas.openxmlformats.org/officeDocument/2006/math" xmlns:aink="http://schemas.microsoft.com/office/drawing/2016/ink" xmlns:am3d="http://schemas.microsoft.com/office/drawing/2017/model3d" xmlns:oel="http://schemas.microsoft.com/office/2019/extlst" xmlns:r="http://schemas.openxmlformats.org/officeDocument/2006/relationships" xmlns:wp14="http://schemas.microsoft.com/office/word/2010/wordprocessingDrawing" xmlns:wp="http://schemas.openxmlformats.org/drawingml/2006/wordprocessingDrawing" xmlns:wpg="http://schemas.microsoft.com/office/word/2010/wordprocessingGroup" xmlns:wpi="http://schemas.microsoft.com/office/word/2010/wordprocessingInk" xmlns:wps="http://schemas.microsoft.com/office/word/2010/wordprocessingShape" xmlns:o="urn:schemas-microsoft-com:office:office" xmlns:v="urn:schemas-microsoft-com:vml" xmlns:w10="urn:schemas-microsoft-com:office:word" xmlns:w="http://schemas.openxmlformats.org/wordprocessingml/2006/main" xmlns:w14="http://schemas.microsoft.com/office/word/2010/wordml" xmlns:w15="http://schemas.microsoft.com/office/word/2012/wordml" xmlns:w16cei="http://schemas.microsoft.com/office/word/2026/wordml/cei" xmlns:w16cex="http://schemas.microsoft.com/office/word/2018/wordml/cex" xmlns:w16cid="http://schemas.microsoft.com/office/word/2016/wordml/cid" xmlns:w16="http://schemas.microsoft.com/office/word/2018/wordml" xmlns:w16sdtdh="http://schemas.microsoft.com/office/word/2020/wordml/sdtdatahash" xmlns:w16sdtfl="http://schemas.microsoft.com/office/word/2024/wordml/sdtformatlock" xmlns:w16se="http://schemas.microsoft.com/office/word/2015/wordml/symex" xmlns:w16du="http://schemas.microsoft.com/office/word/2023/wordml/word16du" xmlns:wne="http://schemas.microsoft.com/office/word/2006/wordml" mc:Ignorable="w14 w15 w16se w16cid w16 w16cex w16sdtdh w16sdtfl w16du wp14">
   <w:body>
     <w:p>
       <w:pPr>
@@ -74,28 +74,7 @@
         <w:t xml:space="preserve">Mattina </w:t>
       </w:r>
       <w:r>
-        <w:t xml:space="preserve">/ </w:t>
-      </w:r>
-      <w:r>
-        <w:t xml:space="preserve">Sera </w:t>
-      </w:r>
-      <w:r>
-        <w:t>(</w:t>
-      </w:r>
-      <w:r>
-        <w:t>Liturgia delle ore CEI</w:t>
-      </w:r>
-      <w:r>
-        <w:t xml:space="preserve">) / </w:t>
-      </w:r>
-      <w:r>
-        <w:t xml:space="preserve">Veglia Restare </w:t>
-      </w:r>
-      <w:r>
-        <w:t>e R</w:t>
-      </w:r>
-      <w:r>
-        <w:t xml:space="preserve">endere grazie </w:t>
+        <w:t xml:space="preserve">/ Sera (Liturgia delle ore CEI) / Veglia Restare e Rendere grazie </w:t>
       </w:r>
     </w:p>
     <w:p>
@@ -114,10 +93,7 @@
         <w:t xml:space="preserve"> - </w:t>
       </w:r>
       <w:r>
-        <w:t xml:space="preserve">Mattina </w:t>
-      </w:r>
-      <w:r>
-        <w:t xml:space="preserve">/ sera </w:t>
+        <w:t xml:space="preserve">Mattina / sera </w:t>
       </w:r>
     </w:p>
     <w:p>
@@ -515,9 +491,19 @@
           <w:color w:val="0A0A0A"/>
           <w:highlight w:val="white"/>
         </w:rPr>
-        <w:t> Siamo arrivati alla fine di questa giornata. Ma cosa abbiamo cercato davvero? Stasera ci mettiamo accanto a una donna che è andata al pozzo per cercare acqua e ha trovato molto di più. Lasciamo che Gesù si sieda accanto a noi e ci chieda: 'Dammi da bere'.</w:t>
-      </w:r>
-    </w:p>
+        <w:t> </w:t>
+      </w:r>
+      <w:bookmarkStart w:id="0" w:name="OLE_LINK1"/>
+      <w:r>
+        <w:rPr>
+          <w:rFonts w:ascii="Arial" w:eastAsia="Arial" w:hAnsi="Arial" w:cs="Arial"/>
+          <w:color w:val="0A0A0A"/>
+          <w:highlight w:val="white"/>
+        </w:rPr>
+        <w:t>Siamo arrivati alla fine di questa giornata. Ma cosa abbiamo cercato davvero? Stasera ci mettiamo accanto a una donna che è andata al pozzo per cercare acqua e ha trovato molto di più. Lasciamo che Gesù si sieda accanto a noi e ci chieda: 'Dammi da bere'.</w:t>
+      </w:r>
+    </w:p>
+    <w:bookmarkEnd w:id="0"/>
     <w:p>
       <w:pPr>
         <w:shd w:val="clear" w:color="auto" w:fill="FFFFFF"/>
@@ -574,17 +560,23 @@
         <w:spacing w:after="0" w:line="240" w:lineRule="auto"/>
         <w:rPr>
           <w:rFonts w:ascii="Arial" w:eastAsia="Arial" w:hAnsi="Arial" w:cs="Arial"/>
-        </w:rPr>
-      </w:pPr>
-      <w:r>
-        <w:rPr>
-          <w:rFonts w:ascii="Arial" w:eastAsia="Arial" w:hAnsi="Arial" w:cs="Arial"/>
+          <w:i/>
+          <w:iCs/>
+        </w:rPr>
+      </w:pPr>
+      <w:r>
+        <w:rPr>
+          <w:rFonts w:ascii="Arial" w:eastAsia="Arial" w:hAnsi="Arial" w:cs="Arial"/>
+          <w:i/>
+          <w:iCs/>
         </w:rPr>
         <w:t>Come la cerva anela</w:t>
       </w:r>
       <w:r>
         <w:rPr>
           <w:rFonts w:ascii="Arial" w:eastAsia="Arial" w:hAnsi="Arial" w:cs="Arial"/>
+          <w:i/>
+          <w:iCs/>
         </w:rPr>
         <w:br/>
         <w:t>ai corsi d'acqua,</w:t>
@@ -592,6 +584,8 @@
       <w:r>
         <w:rPr>
           <w:rFonts w:ascii="Arial" w:eastAsia="Arial" w:hAnsi="Arial" w:cs="Arial"/>
+          <w:i/>
+          <w:iCs/>
         </w:rPr>
         <w:br/>
         <w:t>così l'anima mia anela a te, o Dio.</w:t>
@@ -599,12 +593,16 @@
       <w:r>
         <w:rPr>
           <w:rFonts w:ascii="Arial" w:eastAsia="Arial" w:hAnsi="Arial" w:cs="Arial"/>
-        </w:rPr>
-        <w:br/>
-      </w:r>
-      <w:r>
-        <w:rPr>
-          <w:rFonts w:ascii="Arial" w:eastAsia="Arial" w:hAnsi="Arial" w:cs="Arial"/>
+          <w:i/>
+          <w:iCs/>
+        </w:rPr>
+        <w:br/>
+      </w:r>
+      <w:r>
+        <w:rPr>
+          <w:rFonts w:ascii="Arial" w:eastAsia="Arial" w:hAnsi="Arial" w:cs="Arial"/>
+          <w:i/>
+          <w:iCs/>
         </w:rPr>
         <w:br/>
         <w:t>L'anima mia ha sete di Dio,</w:t>
@@ -612,6 +610,8 @@
       <w:r>
         <w:rPr>
           <w:rFonts w:ascii="Arial" w:eastAsia="Arial" w:hAnsi="Arial" w:cs="Arial"/>
+          <w:i/>
+          <w:iCs/>
         </w:rPr>
         <w:br/>
         <w:t>del Dio vivente:</w:t>
@@ -619,6 +619,8 @@
       <w:r>
         <w:rPr>
           <w:rFonts w:ascii="Arial" w:eastAsia="Arial" w:hAnsi="Arial" w:cs="Arial"/>
+          <w:i/>
+          <w:iCs/>
         </w:rPr>
         <w:br/>
         <w:t>quando verrò e vedrò</w:t>
@@ -626,6 +628,8 @@
       <w:r>
         <w:rPr>
           <w:rFonts w:ascii="Arial" w:eastAsia="Arial" w:hAnsi="Arial" w:cs="Arial"/>
+          <w:i/>
+          <w:iCs/>
         </w:rPr>
         <w:br/>
         <w:t>il volto di Dio?</w:t>
@@ -633,12 +637,16 @@
       <w:r>
         <w:rPr>
           <w:rFonts w:ascii="Arial" w:eastAsia="Arial" w:hAnsi="Arial" w:cs="Arial"/>
-        </w:rPr>
-        <w:br/>
-      </w:r>
-      <w:r>
-        <w:rPr>
-          <w:rFonts w:ascii="Arial" w:eastAsia="Arial" w:hAnsi="Arial" w:cs="Arial"/>
+          <w:i/>
+          <w:iCs/>
+        </w:rPr>
+        <w:br/>
+      </w:r>
+      <w:r>
+        <w:rPr>
+          <w:rFonts w:ascii="Arial" w:eastAsia="Arial" w:hAnsi="Arial" w:cs="Arial"/>
+          <w:i/>
+          <w:iCs/>
         </w:rPr>
         <w:br/>
         <w:t>Le lacrime sono il mio pane</w:t>
@@ -646,6 +654,8 @@
       <w:r>
         <w:rPr>
           <w:rFonts w:ascii="Arial" w:eastAsia="Arial" w:hAnsi="Arial" w:cs="Arial"/>
+          <w:i/>
+          <w:iCs/>
         </w:rPr>
         <w:br/>
         <w:t>giorno e notte,</w:t>
@@ -653,6 +663,8 @@
       <w:r>
         <w:rPr>
           <w:rFonts w:ascii="Arial" w:eastAsia="Arial" w:hAnsi="Arial" w:cs="Arial"/>
+          <w:i/>
+          <w:iCs/>
         </w:rPr>
         <w:br/>
         <w:t>mentre mi dicono sempre:</w:t>
@@ -660,6 +672,8 @@
       <w:r>
         <w:rPr>
           <w:rFonts w:ascii="Arial" w:eastAsia="Arial" w:hAnsi="Arial" w:cs="Arial"/>
+          <w:i/>
+          <w:iCs/>
         </w:rPr>
         <w:br/>
         <w:t>“Dov'è il tuo Dio?”.</w:t>
@@ -667,12 +681,16 @@
       <w:r>
         <w:rPr>
           <w:rFonts w:ascii="Arial" w:eastAsia="Arial" w:hAnsi="Arial" w:cs="Arial"/>
-        </w:rPr>
-        <w:br/>
-      </w:r>
-      <w:r>
-        <w:rPr>
-          <w:rFonts w:ascii="Arial" w:eastAsia="Arial" w:hAnsi="Arial" w:cs="Arial"/>
+          <w:i/>
+          <w:iCs/>
+        </w:rPr>
+        <w:br/>
+      </w:r>
+      <w:r>
+        <w:rPr>
+          <w:rFonts w:ascii="Arial" w:eastAsia="Arial" w:hAnsi="Arial" w:cs="Arial"/>
+          <w:i/>
+          <w:iCs/>
         </w:rPr>
         <w:br/>
         <w:t>Questo io ricordo</w:t>
@@ -680,6 +698,8 @@
       <w:r>
         <w:rPr>
           <w:rFonts w:ascii="Arial" w:eastAsia="Arial" w:hAnsi="Arial" w:cs="Arial"/>
+          <w:i/>
+          <w:iCs/>
         </w:rPr>
         <w:br/>
         <w:t>e l'anima mia si strugge:</w:t>
@@ -687,6 +707,8 @@
       <w:r>
         <w:rPr>
           <w:rFonts w:ascii="Arial" w:eastAsia="Arial" w:hAnsi="Arial" w:cs="Arial"/>
+          <w:i/>
+          <w:iCs/>
         </w:rPr>
         <w:br/>
         <w:t>avanzavo tra la folla,</w:t>
@@ -694,6 +716,8 @@
       <w:r>
         <w:rPr>
           <w:rFonts w:ascii="Arial" w:eastAsia="Arial" w:hAnsi="Arial" w:cs="Arial"/>
+          <w:i/>
+          <w:iCs/>
         </w:rPr>
         <w:br/>
         <w:t>la precedevo fino alla casa di Dio,</w:t>
@@ -701,6 +725,8 @@
       <w:r>
         <w:rPr>
           <w:rFonts w:ascii="Arial" w:eastAsia="Arial" w:hAnsi="Arial" w:cs="Arial"/>
+          <w:i/>
+          <w:iCs/>
         </w:rPr>
         <w:br/>
         <w:t>fra canti di gioia e di lode</w:t>
@@ -708,6 +734,8 @@
       <w:r>
         <w:rPr>
           <w:rFonts w:ascii="Arial" w:eastAsia="Arial" w:hAnsi="Arial" w:cs="Arial"/>
+          <w:i/>
+          <w:iCs/>
         </w:rPr>
         <w:br/>
         <w:t>di una moltitudine in festa.</w:t>
@@ -715,15 +743,670 @@
       <w:r>
         <w:rPr>
           <w:rFonts w:ascii="Arial" w:eastAsia="Arial" w:hAnsi="Arial" w:cs="Arial"/>
-        </w:rPr>
-        <w:br/>
-      </w:r>
-    </w:p>
-    <w:p>
-      <w:pPr>
-        <w:spacing w:after="0" w:line="240" w:lineRule="auto"/>
-        <w:rPr>
-          <w:rFonts w:ascii="Arial" w:eastAsia="Arial" w:hAnsi="Arial" w:cs="Arial"/>
+          <w:i/>
+          <w:iCs/>
+        </w:rPr>
+        <w:br/>
+      </w:r>
+    </w:p>
+    <w:p>
+      <w:pPr>
+        <w:spacing w:after="0" w:line="240" w:lineRule="auto"/>
+        <w:rPr>
+          <w:rFonts w:ascii="Arial" w:eastAsia="Arial" w:hAnsi="Arial" w:cs="Arial"/>
+          <w:i/>
+          <w:iCs/>
+        </w:rPr>
+      </w:pPr>
+      <w:r>
+        <w:rPr>
+          <w:rFonts w:ascii="Arial" w:eastAsia="Arial" w:hAnsi="Arial" w:cs="Arial"/>
+          <w:i/>
+          <w:iCs/>
+        </w:rPr>
+        <w:t>Perché ti rattristi, anima mia,</w:t>
+      </w:r>
+      <w:r>
+        <w:rPr>
+          <w:rFonts w:ascii="Arial" w:eastAsia="Arial" w:hAnsi="Arial" w:cs="Arial"/>
+          <w:i/>
+          <w:iCs/>
+        </w:rPr>
+        <w:br/>
+        <w:t>perché ti agiti in me?</w:t>
+      </w:r>
+      <w:r>
+        <w:rPr>
+          <w:rFonts w:ascii="Arial" w:eastAsia="Arial" w:hAnsi="Arial" w:cs="Arial"/>
+          <w:i/>
+          <w:iCs/>
+        </w:rPr>
+        <w:br/>
+        <w:t>Spera in Dio: ancora potrò lodarlo,</w:t>
+      </w:r>
+      <w:r>
+        <w:rPr>
+          <w:rFonts w:ascii="Arial" w:eastAsia="Arial" w:hAnsi="Arial" w:cs="Arial"/>
+          <w:i/>
+          <w:iCs/>
+        </w:rPr>
+        <w:br/>
+        <w:t>lui, salvezza del mio volto e mio Dio.</w:t>
+      </w:r>
+    </w:p>
+    <w:p>
+      <w:pPr>
+        <w:spacing w:after="0" w:line="240" w:lineRule="auto"/>
+        <w:rPr>
+          <w:rFonts w:ascii="Arial" w:eastAsia="Arial" w:hAnsi="Arial" w:cs="Arial"/>
+          <w:i/>
+          <w:iCs/>
+        </w:rPr>
+      </w:pPr>
+    </w:p>
+    <w:p>
+      <w:pPr>
+        <w:spacing w:after="0" w:line="240" w:lineRule="auto"/>
+        <w:rPr>
+          <w:rFonts w:ascii="Arial" w:eastAsia="Arial" w:hAnsi="Arial" w:cs="Arial"/>
+          <w:i/>
+          <w:iCs/>
+        </w:rPr>
+      </w:pPr>
+    </w:p>
+    <w:p>
+      <w:pPr>
+        <w:spacing w:after="0" w:line="240" w:lineRule="auto"/>
+        <w:rPr>
+          <w:rFonts w:ascii="Arial" w:eastAsia="Arial" w:hAnsi="Arial" w:cs="Arial"/>
+          <w:i/>
+          <w:iCs/>
+        </w:rPr>
+      </w:pPr>
+      <w:r>
+        <w:rPr>
+          <w:rFonts w:ascii="Arial" w:eastAsia="Arial" w:hAnsi="Arial" w:cs="Arial"/>
+          <w:i/>
+          <w:iCs/>
+        </w:rPr>
+        <w:t>In me si rattrista l'anima mia;</w:t>
+      </w:r>
+    </w:p>
+    <w:p>
+      <w:pPr>
+        <w:spacing w:after="0" w:line="240" w:lineRule="auto"/>
+        <w:rPr>
+          <w:rFonts w:ascii="Arial" w:eastAsia="Arial" w:hAnsi="Arial" w:cs="Arial"/>
+          <w:i/>
+          <w:iCs/>
+        </w:rPr>
+      </w:pPr>
+      <w:r>
+        <w:rPr>
+          <w:rFonts w:ascii="Arial" w:eastAsia="Arial" w:hAnsi="Arial" w:cs="Arial"/>
+          <w:i/>
+          <w:iCs/>
+        </w:rPr>
+        <w:t>perciò di te mi ricordo</w:t>
+      </w:r>
+      <w:r>
+        <w:rPr>
+          <w:rFonts w:ascii="Arial" w:eastAsia="Arial" w:hAnsi="Arial" w:cs="Arial"/>
+          <w:i/>
+          <w:iCs/>
+        </w:rPr>
+        <w:br/>
+        <w:t>dalla terra del Giordano e dell'Ermon,</w:t>
+      </w:r>
+      <w:r>
+        <w:rPr>
+          <w:rFonts w:ascii="Arial" w:eastAsia="Arial" w:hAnsi="Arial" w:cs="Arial"/>
+          <w:i/>
+          <w:iCs/>
+        </w:rPr>
+        <w:br/>
+        <w:t>dal monte Misar.</w:t>
+      </w:r>
+      <w:r>
+        <w:rPr>
+          <w:rFonts w:ascii="Arial" w:eastAsia="Arial" w:hAnsi="Arial" w:cs="Arial"/>
+          <w:i/>
+          <w:iCs/>
+        </w:rPr>
+        <w:br/>
+      </w:r>
+      <w:r>
+        <w:rPr>
+          <w:rFonts w:ascii="Arial" w:eastAsia="Arial" w:hAnsi="Arial" w:cs="Arial"/>
+          <w:i/>
+          <w:iCs/>
+        </w:rPr>
+        <w:br/>
+        <w:t>Un abisso chiama l'abisso</w:t>
+      </w:r>
+      <w:r>
+        <w:rPr>
+          <w:rFonts w:ascii="Arial" w:eastAsia="Arial" w:hAnsi="Arial" w:cs="Arial"/>
+          <w:i/>
+          <w:iCs/>
+        </w:rPr>
+        <w:br/>
+        <w:t>al fragore delle tue cascate;</w:t>
+      </w:r>
+      <w:r>
+        <w:rPr>
+          <w:rFonts w:ascii="Arial" w:eastAsia="Arial" w:hAnsi="Arial" w:cs="Arial"/>
+          <w:i/>
+          <w:iCs/>
+        </w:rPr>
+        <w:br/>
+        <w:t>tutti i tuoi flutti e le tue onde</w:t>
+      </w:r>
+      <w:r>
+        <w:rPr>
+          <w:rFonts w:ascii="Arial" w:eastAsia="Arial" w:hAnsi="Arial" w:cs="Arial"/>
+          <w:i/>
+          <w:iCs/>
+        </w:rPr>
+        <w:br/>
+        <w:t>sopra di me sono passati.</w:t>
+      </w:r>
+      <w:r>
+        <w:rPr>
+          <w:rFonts w:ascii="Arial" w:eastAsia="Arial" w:hAnsi="Arial" w:cs="Arial"/>
+          <w:i/>
+          <w:iCs/>
+        </w:rPr>
+        <w:br/>
+      </w:r>
+      <w:r>
+        <w:rPr>
+          <w:rFonts w:ascii="Arial" w:eastAsia="Arial" w:hAnsi="Arial" w:cs="Arial"/>
+          <w:i/>
+          <w:iCs/>
+        </w:rPr>
+        <w:br/>
+        <w:t>Di giorno il Signore mi dona il suo amore</w:t>
+      </w:r>
+      <w:r>
+        <w:rPr>
+          <w:rFonts w:ascii="Arial" w:eastAsia="Arial" w:hAnsi="Arial" w:cs="Arial"/>
+          <w:i/>
+          <w:iCs/>
+        </w:rPr>
+        <w:br/>
+      </w:r>
+      <w:r>
+        <w:rPr>
+          <w:rFonts w:ascii="Arial" w:eastAsia="Arial" w:hAnsi="Arial" w:cs="Arial"/>
+          <w:i/>
+          <w:iCs/>
+        </w:rPr>
+        <w:lastRenderedPageBreak/>
+        <w:t>e di notte il suo canto è con me,</w:t>
+      </w:r>
+      <w:r>
+        <w:rPr>
+          <w:rFonts w:ascii="Arial" w:eastAsia="Arial" w:hAnsi="Arial" w:cs="Arial"/>
+          <w:i/>
+          <w:iCs/>
+        </w:rPr>
+        <w:br/>
+        <w:t>preghiera al Dio vivente.</w:t>
+      </w:r>
+      <w:r>
+        <w:rPr>
+          <w:rFonts w:ascii="Arial" w:eastAsia="Arial" w:hAnsi="Arial" w:cs="Arial"/>
+          <w:i/>
+          <w:iCs/>
+        </w:rPr>
+        <w:br/>
+      </w:r>
+      <w:r>
+        <w:rPr>
+          <w:rFonts w:ascii="Arial" w:eastAsia="Arial" w:hAnsi="Arial" w:cs="Arial"/>
+          <w:i/>
+          <w:iCs/>
+        </w:rPr>
+        <w:br/>
+        <w:t>Dirò a Dio: “Mia roccia!</w:t>
+      </w:r>
+      <w:r>
+        <w:rPr>
+          <w:rFonts w:ascii="Arial" w:eastAsia="Arial" w:hAnsi="Arial" w:cs="Arial"/>
+          <w:i/>
+          <w:iCs/>
+        </w:rPr>
+        <w:br/>
+        <w:t>Perché mi hai dimenticato?</w:t>
+      </w:r>
+      <w:r>
+        <w:rPr>
+          <w:rFonts w:ascii="Arial" w:eastAsia="Arial" w:hAnsi="Arial" w:cs="Arial"/>
+          <w:i/>
+          <w:iCs/>
+        </w:rPr>
+        <w:br/>
+        <w:t>Perché triste me ne vado,</w:t>
+      </w:r>
+      <w:r>
+        <w:rPr>
+          <w:rFonts w:ascii="Arial" w:eastAsia="Arial" w:hAnsi="Arial" w:cs="Arial"/>
+          <w:i/>
+          <w:iCs/>
+        </w:rPr>
+        <w:br/>
+        <w:t>oppresso dal nemico?”</w:t>
+      </w:r>
+      <w:r>
+        <w:rPr>
+          <w:rFonts w:ascii="Arial" w:eastAsia="Arial" w:hAnsi="Arial" w:cs="Arial"/>
+          <w:i/>
+          <w:iCs/>
+        </w:rPr>
+        <w:br/>
+      </w:r>
+      <w:r>
+        <w:rPr>
+          <w:rFonts w:ascii="Arial" w:eastAsia="Arial" w:hAnsi="Arial" w:cs="Arial"/>
+          <w:i/>
+          <w:iCs/>
+        </w:rPr>
+        <w:br/>
+        <w:t>Mi insultano i miei avversari</w:t>
+      </w:r>
+      <w:r>
+        <w:rPr>
+          <w:rFonts w:ascii="Arial" w:eastAsia="Arial" w:hAnsi="Arial" w:cs="Arial"/>
+          <w:i/>
+          <w:iCs/>
+        </w:rPr>
+        <w:br/>
+        <w:t>quando rompono le mie ossa,</w:t>
+      </w:r>
+      <w:r>
+        <w:rPr>
+          <w:rFonts w:ascii="Arial" w:eastAsia="Arial" w:hAnsi="Arial" w:cs="Arial"/>
+          <w:i/>
+          <w:iCs/>
+        </w:rPr>
+        <w:br/>
+        <w:t>mentre mi dicono sempre:</w:t>
+      </w:r>
+      <w:r>
+        <w:rPr>
+          <w:rFonts w:ascii="Arial" w:eastAsia="Arial" w:hAnsi="Arial" w:cs="Arial"/>
+          <w:i/>
+          <w:iCs/>
+        </w:rPr>
+        <w:br/>
+        <w:t>“Dov'è il tuo Dio?”.</w:t>
+      </w:r>
+    </w:p>
+    <w:p>
+      <w:pPr>
+        <w:spacing w:after="0" w:line="240" w:lineRule="auto"/>
+        <w:rPr>
+          <w:rFonts w:ascii="Arial" w:eastAsia="Arial" w:hAnsi="Arial" w:cs="Arial"/>
+          <w:i/>
+          <w:iCs/>
+        </w:rPr>
+      </w:pPr>
+    </w:p>
+    <w:p>
+      <w:pPr>
+        <w:spacing w:after="0" w:line="240" w:lineRule="auto"/>
+        <w:rPr>
+          <w:rFonts w:ascii="Arial" w:eastAsia="Arial" w:hAnsi="Arial" w:cs="Arial"/>
+          <w:i/>
+          <w:iCs/>
+        </w:rPr>
+      </w:pPr>
+      <w:r>
+        <w:rPr>
+          <w:rFonts w:ascii="Arial" w:eastAsia="Arial" w:hAnsi="Arial" w:cs="Arial"/>
+          <w:i/>
+          <w:iCs/>
+        </w:rPr>
+        <w:t>Perché ti rattristi, anima mia,</w:t>
+      </w:r>
+      <w:r>
+        <w:rPr>
+          <w:rFonts w:ascii="Arial" w:eastAsia="Arial" w:hAnsi="Arial" w:cs="Arial"/>
+          <w:i/>
+          <w:iCs/>
+        </w:rPr>
+        <w:br/>
+        <w:t>perché ti agiti in me?</w:t>
+      </w:r>
+      <w:r>
+        <w:rPr>
+          <w:rFonts w:ascii="Arial" w:eastAsia="Arial" w:hAnsi="Arial" w:cs="Arial"/>
+          <w:i/>
+          <w:iCs/>
+        </w:rPr>
+        <w:br/>
+        <w:t>Spera in Dio: ancora potrò lodarlo,</w:t>
+      </w:r>
+      <w:r>
+        <w:rPr>
+          <w:rFonts w:ascii="Arial" w:eastAsia="Arial" w:hAnsi="Arial" w:cs="Arial"/>
+          <w:i/>
+          <w:iCs/>
+        </w:rPr>
+        <w:br/>
+        <w:t>lui, salvezza del mio volto e mio Dio</w:t>
+      </w:r>
+    </w:p>
+    <w:p>
+      <w:pPr>
+        <w:spacing w:after="0" w:line="240" w:lineRule="auto"/>
+        <w:rPr>
+          <w:rFonts w:ascii="Arial" w:eastAsia="Arial" w:hAnsi="Arial" w:cs="Arial"/>
+        </w:rPr>
+      </w:pPr>
+    </w:p>
+    <w:p>
+      <w:pPr>
+        <w:spacing w:after="0" w:line="240" w:lineRule="auto"/>
+        <w:rPr>
+          <w:rFonts w:ascii="Arial" w:eastAsia="Arial" w:hAnsi="Arial" w:cs="Arial"/>
+        </w:rPr>
+        <w:sectPr>
+          <w:type w:val="continuous"/>
+          <w:pgSz w:w="11906" w:h="16838"/>
+          <w:pgMar w:top="1417" w:right="1134" w:bottom="1134" w:left="1134" w:header="708" w:footer="708" w:gutter="0"/>
+          <w:cols w:space="720"/>
+        </w:sectPr>
+      </w:pPr>
+    </w:p>
+    <w:p>
+      <w:pPr>
+        <w:spacing w:after="0" w:line="240" w:lineRule="auto"/>
+        <w:rPr>
+          <w:rFonts w:ascii="Arial" w:eastAsia="Arial" w:hAnsi="Arial" w:cs="Arial"/>
+          <w:b/>
+          <w:bCs/>
+          <w:color w:val="0A0A0A"/>
+          <w:highlight w:val="white"/>
+        </w:rPr>
+        <w:sectPr>
+          <w:type w:val="continuous"/>
+          <w:pgSz w:w="11906" w:h="16838"/>
+          <w:pgMar w:top="1417" w:right="1134" w:bottom="1134" w:left="1134" w:header="708" w:footer="708" w:gutter="0"/>
+          <w:cols w:space="720"/>
+        </w:sectPr>
+      </w:pPr>
+      <w:r>
+        <w:rPr>
+          <w:rFonts w:ascii="Arial" w:eastAsia="Arial" w:hAnsi="Arial" w:cs="Arial"/>
+          <w:b/>
+          <w:bCs/>
+          <w:color w:val="0A0A0A"/>
+          <w:highlight w:val="white"/>
+        </w:rPr>
+        <w:t xml:space="preserve">T: </w:t>
+      </w:r>
+      <w:r>
+        <w:rPr>
+          <w:rFonts w:ascii="Arial" w:eastAsia="Arial" w:hAnsi="Arial" w:cs="Arial"/>
+          <w:color w:val="0A0A0A"/>
+          <w:highlight w:val="white"/>
+        </w:rPr>
+        <w:t>Gloria al Padre al Figlio e allo Spirito Santo</w:t>
+      </w:r>
+      <w:r>
+        <w:rPr>
+          <w:rFonts w:ascii="Arial" w:eastAsia="Arial" w:hAnsi="Arial" w:cs="Arial"/>
+          <w:b/>
+          <w:bCs/>
+          <w:color w:val="0A0A0A"/>
+          <w:highlight w:val="white"/>
+        </w:rPr>
+        <w:t xml:space="preserve">, </w:t>
+      </w:r>
+      <w:r>
+        <w:rPr>
+          <w:rFonts w:ascii="Arial" w:eastAsia="Arial" w:hAnsi="Arial" w:cs="Arial"/>
+          <w:color w:val="0A0A0A"/>
+          <w:highlight w:val="white"/>
+        </w:rPr>
+        <w:t>come era nel principio</w:t>
+      </w:r>
+      <w:r>
+        <w:rPr>
+          <w:rFonts w:ascii="Arial" w:eastAsia="Arial" w:hAnsi="Arial" w:cs="Arial"/>
+          <w:color w:val="0A0A0A"/>
+          <w:highlight w:val="white"/>
+        </w:rPr>
+        <w:t>,</w:t>
+      </w:r>
+      <w:r>
+        <w:rPr>
+          <w:rFonts w:ascii="Arial" w:eastAsia="Arial" w:hAnsi="Arial" w:cs="Arial"/>
+          <w:color w:val="0A0A0A"/>
+          <w:highlight w:val="white"/>
+        </w:rPr>
+        <w:t xml:space="preserve"> ora e sempre nei secoli dei secoli. Amen.</w:t>
+      </w:r>
+    </w:p>
+    <w:p>
+      <w:pPr>
+        <w:spacing w:after="0" w:line="240" w:lineRule="auto"/>
+        <w:rPr>
+          <w:rFonts w:ascii="Arial" w:eastAsia="Arial" w:hAnsi="Arial" w:cs="Arial"/>
+        </w:rPr>
+      </w:pPr>
+    </w:p>
+    <w:p>
+      <w:pPr>
+        <w:spacing w:after="0" w:line="240" w:lineRule="auto"/>
+        <w:rPr>
+          <w:rFonts w:ascii="Arial" w:eastAsia="Arial" w:hAnsi="Arial" w:cs="Arial"/>
+          <w:b/>
+          <w:bCs/>
+          <w:color w:val="0A0A0A"/>
+          <w:highlight w:val="white"/>
+        </w:rPr>
+      </w:pPr>
+    </w:p>
+    <w:p>
+      <w:pPr>
+        <w:spacing w:after="0" w:line="240" w:lineRule="auto"/>
+        <w:rPr>
+          <w:rFonts w:ascii="Arial" w:eastAsia="Arial" w:hAnsi="Arial" w:cs="Arial"/>
+          <w:b/>
+          <w:bCs/>
+          <w:color w:val="0A0A0A"/>
+          <w:highlight w:val="white"/>
+        </w:rPr>
+      </w:pPr>
+    </w:p>
+    <w:p>
+      <w:pPr>
+        <w:spacing w:after="0" w:line="240" w:lineRule="auto"/>
+        <w:rPr>
+          <w:rFonts w:ascii="Arial" w:eastAsia="Arial" w:hAnsi="Arial" w:cs="Arial"/>
+          <w:b/>
+          <w:bCs/>
+          <w:color w:val="0A0A0A"/>
+          <w:highlight w:val="white"/>
+        </w:rPr>
+      </w:pPr>
+    </w:p>
+    <w:p>
+      <w:pPr>
+        <w:spacing w:after="0" w:line="240" w:lineRule="auto"/>
+        <w:rPr>
+          <w:rFonts w:ascii="Arial" w:eastAsia="Arial" w:hAnsi="Arial" w:cs="Arial"/>
+          <w:b/>
+          <w:bCs/>
+          <w:color w:val="0A0A0A"/>
+          <w:highlight w:val="white"/>
+        </w:rPr>
+      </w:pPr>
+    </w:p>
+    <w:p>
+      <w:pPr>
+        <w:spacing w:after="0" w:line="240" w:lineRule="auto"/>
+        <w:rPr>
+          <w:rFonts w:ascii="Arial" w:eastAsia="Arial" w:hAnsi="Arial" w:cs="Arial"/>
+          <w:b/>
+          <w:bCs/>
+          <w:color w:val="0A0A0A"/>
+          <w:highlight w:val="white"/>
+        </w:rPr>
+      </w:pPr>
+    </w:p>
+    <w:p>
+      <w:pPr>
+        <w:spacing w:after="0" w:line="240" w:lineRule="auto"/>
+        <w:rPr>
+          <w:rFonts w:ascii="Arial" w:eastAsia="Arial" w:hAnsi="Arial" w:cs="Arial"/>
+          <w:b/>
+          <w:bCs/>
+          <w:color w:val="0A0A0A"/>
+          <w:highlight w:val="white"/>
+        </w:rPr>
+      </w:pPr>
+    </w:p>
+    <w:p>
+      <w:pPr>
+        <w:spacing w:after="0" w:line="240" w:lineRule="auto"/>
+        <w:rPr>
+          <w:rFonts w:ascii="Arial" w:eastAsia="Arial" w:hAnsi="Arial" w:cs="Arial"/>
+          <w:b/>
+          <w:bCs/>
+          <w:color w:val="0A0A0A"/>
+          <w:highlight w:val="white"/>
+        </w:rPr>
+      </w:pPr>
+    </w:p>
+    <w:p>
+      <w:pPr>
+        <w:spacing w:after="0" w:line="240" w:lineRule="auto"/>
+        <w:rPr>
+          <w:rFonts w:ascii="Arial" w:eastAsia="Arial" w:hAnsi="Arial" w:cs="Arial"/>
+          <w:b/>
+          <w:bCs/>
+          <w:color w:val="0A0A0A"/>
+          <w:highlight w:val="white"/>
+        </w:rPr>
+      </w:pPr>
+    </w:p>
+    <w:p>
+      <w:pPr>
+        <w:spacing w:after="0" w:line="240" w:lineRule="auto"/>
+        <w:rPr>
+          <w:rFonts w:ascii="Arial" w:eastAsia="Arial" w:hAnsi="Arial" w:cs="Arial"/>
+          <w:b/>
+          <w:bCs/>
+          <w:color w:val="0A0A0A"/>
+          <w:highlight w:val="white"/>
+        </w:rPr>
+      </w:pPr>
+    </w:p>
+    <w:p>
+      <w:pPr>
+        <w:spacing w:after="0" w:line="240" w:lineRule="auto"/>
+        <w:rPr>
+          <w:rFonts w:ascii="Arial" w:eastAsia="Arial" w:hAnsi="Arial" w:cs="Arial"/>
+          <w:b/>
+          <w:bCs/>
+          <w:color w:val="0A0A0A"/>
+          <w:highlight w:val="white"/>
+        </w:rPr>
+      </w:pPr>
+    </w:p>
+    <w:p>
+      <w:pPr>
+        <w:spacing w:after="0" w:line="240" w:lineRule="auto"/>
+        <w:rPr>
+          <w:rFonts w:ascii="Arial" w:eastAsia="Arial" w:hAnsi="Arial" w:cs="Arial"/>
+          <w:b/>
+          <w:bCs/>
+          <w:color w:val="0A0A0A"/>
+          <w:highlight w:val="white"/>
+        </w:rPr>
+      </w:pPr>
+    </w:p>
+    <w:p>
+      <w:pPr>
+        <w:spacing w:after="0" w:line="240" w:lineRule="auto"/>
+        <w:rPr>
+          <w:rFonts w:ascii="Arial" w:eastAsia="Arial" w:hAnsi="Arial" w:cs="Arial"/>
+          <w:b/>
+          <w:bCs/>
+          <w:color w:val="0A0A0A"/>
+          <w:highlight w:val="white"/>
+        </w:rPr>
+      </w:pPr>
+      <w:r>
+        <w:rPr>
+          <w:rFonts w:ascii="Arial" w:eastAsia="Arial" w:hAnsi="Arial" w:cs="Arial"/>
+          <w:b/>
+          <w:bCs/>
+          <w:color w:val="0A0A0A"/>
+          <w:highlight w:val="white"/>
+        </w:rPr>
+        <w:t>Vangelo secondo Giovanni (</w:t>
+      </w:r>
+      <w:proofErr w:type="spellStart"/>
+      <w:r>
+        <w:rPr>
+          <w:rFonts w:ascii="Arial" w:eastAsia="Arial" w:hAnsi="Arial" w:cs="Arial"/>
+          <w:b/>
+          <w:bCs/>
+          <w:color w:val="0A0A0A"/>
+          <w:highlight w:val="white"/>
+        </w:rPr>
+        <w:t>Gv</w:t>
+      </w:r>
+      <w:proofErr w:type="spellEnd"/>
+      <w:r>
+        <w:rPr>
+          <w:rFonts w:ascii="Arial" w:eastAsia="Arial" w:hAnsi="Arial" w:cs="Arial"/>
+          <w:b/>
+          <w:bCs/>
+          <w:color w:val="0A0A0A"/>
+          <w:highlight w:val="white"/>
+        </w:rPr>
+        <w:t xml:space="preserve"> 4, 5-15)</w:t>
+      </w:r>
+    </w:p>
+    <w:p>
+      <w:pPr>
+        <w:spacing w:after="0" w:line="240" w:lineRule="auto"/>
+        <w:rPr>
+          <w:rFonts w:ascii="Arial" w:eastAsia="Arial" w:hAnsi="Arial" w:cs="Arial"/>
+          <w:b/>
+          <w:bCs/>
+          <w:color w:val="0A0A0A"/>
+          <w:highlight w:val="white"/>
+        </w:rPr>
+      </w:pPr>
+    </w:p>
+    <w:p>
+      <w:pPr>
+        <w:spacing w:after="0" w:line="240" w:lineRule="auto"/>
+        <w:rPr>
+          <w:rFonts w:ascii="Arial" w:eastAsia="Arial" w:hAnsi="Arial" w:cs="Arial"/>
+          <w:b/>
+          <w:bCs/>
+          <w:color w:val="0A0A0A"/>
+          <w:highlight w:val="white"/>
+        </w:rPr>
+      </w:pPr>
+    </w:p>
+    <w:p>
+      <w:pPr>
+        <w:spacing w:after="0" w:line="240" w:lineRule="auto"/>
+        <w:rPr>
+          <w:rFonts w:ascii="Arial" w:eastAsia="Arial" w:hAnsi="Arial" w:cs="Arial"/>
+          <w:b/>
+          <w:bCs/>
+          <w:color w:val="0A0A0A"/>
+          <w:highlight w:val="white"/>
         </w:rPr>
         <w:sectPr>
           <w:type w:val="continuous"/>
@@ -735,235 +1418,1114 @@
           </w:cols>
         </w:sectPr>
       </w:pPr>
-      <w:r>
-        <w:rPr>
-          <w:rFonts w:ascii="Arial" w:eastAsia="Arial" w:hAnsi="Arial" w:cs="Arial"/>
-        </w:rPr>
-        <w:t>Perché ti rattristi, anima mia,</w:t>
-      </w:r>
-      <w:r>
-        <w:rPr>
-          <w:rFonts w:ascii="Arial" w:eastAsia="Arial" w:hAnsi="Arial" w:cs="Arial"/>
-        </w:rPr>
-        <w:br/>
-        <w:t>perché ti agiti in me?</w:t>
-      </w:r>
-      <w:r>
-        <w:rPr>
-          <w:rFonts w:ascii="Arial" w:eastAsia="Arial" w:hAnsi="Arial" w:cs="Arial"/>
-        </w:rPr>
-        <w:br/>
-        <w:t>Spera in Dio: ancora potrò lodarlo,</w:t>
-      </w:r>
-      <w:r>
-        <w:rPr>
-          <w:rFonts w:ascii="Arial" w:eastAsia="Arial" w:hAnsi="Arial" w:cs="Arial"/>
-        </w:rPr>
-        <w:br/>
-      </w:r>
-      <w:r>
-        <w:rPr>
-          <w:rFonts w:ascii="Arial" w:eastAsia="Arial" w:hAnsi="Arial" w:cs="Arial"/>
-        </w:rPr>
-        <w:t>lui, salvezza del mio volto e mio Dio.</w:t>
-      </w:r>
-      <w:r>
-        <w:rPr>
-          <w:rFonts w:ascii="Arial" w:eastAsia="Arial" w:hAnsi="Arial" w:cs="Arial"/>
-        </w:rPr>
-        <w:br/>
-        <w:t>In me si rattrista l'anima mia;</w:t>
-      </w:r>
-      <w:r>
-        <w:rPr>
-          <w:rFonts w:ascii="Arial" w:eastAsia="Arial" w:hAnsi="Arial" w:cs="Arial"/>
-        </w:rPr>
-        <w:br/>
-        <w:t>perciò di te mi ricordo</w:t>
-      </w:r>
-      <w:r>
-        <w:rPr>
-          <w:rFonts w:ascii="Arial" w:eastAsia="Arial" w:hAnsi="Arial" w:cs="Arial"/>
-        </w:rPr>
-        <w:br/>
-        <w:t>dalla terra del Giordano e dell'</w:t>
-      </w:r>
-      <w:proofErr w:type="spellStart"/>
-      <w:r>
-        <w:rPr>
-          <w:rFonts w:ascii="Arial" w:eastAsia="Arial" w:hAnsi="Arial" w:cs="Arial"/>
-        </w:rPr>
-        <w:t>Ermon</w:t>
-      </w:r>
-      <w:proofErr w:type="spellEnd"/>
-      <w:r>
-        <w:rPr>
-          <w:rFonts w:ascii="Arial" w:eastAsia="Arial" w:hAnsi="Arial" w:cs="Arial"/>
-        </w:rPr>
-        <w:t>,</w:t>
-      </w:r>
-      <w:r>
-        <w:rPr>
-          <w:rFonts w:ascii="Arial" w:eastAsia="Arial" w:hAnsi="Arial" w:cs="Arial"/>
-        </w:rPr>
-        <w:br/>
-        <w:t xml:space="preserve">dal monte </w:t>
-      </w:r>
-      <w:proofErr w:type="spellStart"/>
-      <w:r>
-        <w:rPr>
-          <w:rFonts w:ascii="Arial" w:eastAsia="Arial" w:hAnsi="Arial" w:cs="Arial"/>
-        </w:rPr>
-        <w:t>Misar</w:t>
-      </w:r>
-      <w:proofErr w:type="spellEnd"/>
-      <w:r>
-        <w:rPr>
-          <w:rFonts w:ascii="Arial" w:eastAsia="Arial" w:hAnsi="Arial" w:cs="Arial"/>
-        </w:rPr>
-        <w:t>.</w:t>
-      </w:r>
-      <w:r>
-        <w:rPr>
-          <w:rFonts w:ascii="Arial" w:eastAsia="Arial" w:hAnsi="Arial" w:cs="Arial"/>
-        </w:rPr>
-        <w:br/>
-      </w:r>
-      <w:r>
-        <w:rPr>
-          <w:rFonts w:ascii="Arial" w:eastAsia="Arial" w:hAnsi="Arial" w:cs="Arial"/>
-        </w:rPr>
-        <w:br/>
-        <w:t>Un abisso chiama l'abisso</w:t>
-      </w:r>
-      <w:r>
-        <w:rPr>
-          <w:rFonts w:ascii="Arial" w:eastAsia="Arial" w:hAnsi="Arial" w:cs="Arial"/>
-        </w:rPr>
-        <w:br/>
-        <w:t>al fragore delle tue cascate;</w:t>
-      </w:r>
-      <w:r>
-        <w:rPr>
-          <w:rFonts w:ascii="Arial" w:eastAsia="Arial" w:hAnsi="Arial" w:cs="Arial"/>
-        </w:rPr>
-        <w:br/>
-        <w:t>tutti i tuoi flutti e le tue onde</w:t>
-      </w:r>
-      <w:r>
-        <w:rPr>
-          <w:rFonts w:ascii="Arial" w:eastAsia="Arial" w:hAnsi="Arial" w:cs="Arial"/>
-        </w:rPr>
-        <w:br/>
-        <w:t>sopra di me sono passati.</w:t>
-      </w:r>
-      <w:r>
-        <w:rPr>
-          <w:rFonts w:ascii="Arial" w:eastAsia="Arial" w:hAnsi="Arial" w:cs="Arial"/>
-        </w:rPr>
-        <w:br/>
-      </w:r>
-      <w:r>
-        <w:rPr>
-          <w:rFonts w:ascii="Arial" w:eastAsia="Arial" w:hAnsi="Arial" w:cs="Arial"/>
-        </w:rPr>
-        <w:br/>
-        <w:t>Di giorno il Signore mi dona il suo amore</w:t>
-      </w:r>
-      <w:r>
-        <w:rPr>
-          <w:rFonts w:ascii="Arial" w:eastAsia="Arial" w:hAnsi="Arial" w:cs="Arial"/>
-        </w:rPr>
-        <w:br/>
-        <w:t>e di notte il suo canto è con me,</w:t>
-      </w:r>
-      <w:r>
-        <w:rPr>
-          <w:rFonts w:ascii="Arial" w:eastAsia="Arial" w:hAnsi="Arial" w:cs="Arial"/>
-        </w:rPr>
-        <w:br/>
-        <w:t>preghiera al Dio della mia vita.</w:t>
-      </w:r>
-      <w:r>
-        <w:rPr>
-          <w:rFonts w:ascii="Arial" w:eastAsia="Arial" w:hAnsi="Arial" w:cs="Arial"/>
-        </w:rPr>
-        <w:br/>
-      </w:r>
-      <w:r>
-        <w:rPr>
-          <w:rFonts w:ascii="Arial" w:eastAsia="Arial" w:hAnsi="Arial" w:cs="Arial"/>
-        </w:rPr>
-        <w:br/>
-        <w:t>Dirò a Dio: “Mia roccia!</w:t>
-      </w:r>
-      <w:r>
-        <w:rPr>
-          <w:rFonts w:ascii="Arial" w:eastAsia="Arial" w:hAnsi="Arial" w:cs="Arial"/>
-        </w:rPr>
-        <w:br/>
-        <w:t>Perché mi hai dimenticato?</w:t>
-      </w:r>
-      <w:r>
-        <w:rPr>
-          <w:rFonts w:ascii="Arial" w:eastAsia="Arial" w:hAnsi="Arial" w:cs="Arial"/>
-        </w:rPr>
-        <w:br/>
-        <w:t>Perché triste me ne vado,</w:t>
-      </w:r>
-      <w:r>
-        <w:rPr>
-          <w:rFonts w:ascii="Arial" w:eastAsia="Arial" w:hAnsi="Arial" w:cs="Arial"/>
-        </w:rPr>
-        <w:br/>
-        <w:t>oppresso dal nemico?”</w:t>
-      </w:r>
-      <w:r>
-        <w:rPr>
-          <w:rFonts w:ascii="Arial" w:eastAsia="Arial" w:hAnsi="Arial" w:cs="Arial"/>
-        </w:rPr>
-        <w:br/>
-      </w:r>
-      <w:r>
-        <w:rPr>
-          <w:rFonts w:ascii="Arial" w:eastAsia="Arial" w:hAnsi="Arial" w:cs="Arial"/>
-        </w:rPr>
-        <w:br/>
-        <w:t>Mi insultano i miei avversari</w:t>
-      </w:r>
-      <w:r>
-        <w:rPr>
-          <w:rFonts w:ascii="Arial" w:eastAsia="Arial" w:hAnsi="Arial" w:cs="Arial"/>
-        </w:rPr>
-        <w:br/>
-        <w:t>quando rompono le mie ossa,</w:t>
-      </w:r>
-      <w:r>
-        <w:rPr>
-          <w:rFonts w:ascii="Arial" w:eastAsia="Arial" w:hAnsi="Arial" w:cs="Arial"/>
-        </w:rPr>
-        <w:br/>
-        <w:t>mentre mi dicono sempre:</w:t>
-      </w:r>
-      <w:r>
-        <w:rPr>
-          <w:rFonts w:ascii="Arial" w:eastAsia="Arial" w:hAnsi="Arial" w:cs="Arial"/>
-        </w:rPr>
-        <w:br/>
-        <w:t>“Dov'è il tuo Dio?”.</w:t>
-      </w:r>
-      <w:r>
-        <w:rPr>
-          <w:rFonts w:ascii="Arial" w:eastAsia="Arial" w:hAnsi="Arial" w:cs="Arial"/>
-        </w:rPr>
-        <w:br/>
-      </w:r>
-    </w:p>
-    <w:p>
-      <w:pPr>
-        <w:spacing w:after="0" w:line="240" w:lineRule="auto"/>
-        <w:rPr>
-          <w:rFonts w:ascii="Arial" w:eastAsia="Arial" w:hAnsi="Arial" w:cs="Arial"/>
+    </w:p>
+    <w:p>
+      <w:pPr>
+        <w:spacing w:after="0" w:line="240" w:lineRule="auto"/>
+        <w:rPr>
+          <w:rFonts w:ascii="Arial" w:eastAsia="Arial" w:hAnsi="Arial" w:cs="Arial"/>
+          <w:color w:val="000000"/>
+          <w:highlight w:val="white"/>
+        </w:rPr>
+      </w:pPr>
+      <w:bookmarkStart w:id="1" w:name="_Hlk230687095"/>
+      <w:r>
+        <w:rPr>
+          <w:rFonts w:ascii="Arial" w:eastAsia="Arial" w:hAnsi="Arial" w:cs="Arial"/>
+          <w:color w:val="000000"/>
+          <w:highlight w:val="white"/>
+        </w:rPr>
+        <w:t>Giunse dunque a una città della Samaria, chiamata Sicar, vicina al podere che Giacobbe aveva dato a suo figlio Giuseppe; e là c'era la fonte di Giacobbe. Gesù dunque, stanco del cammino, stava così a sedere presso la fonte. Era circa l'ora sesta.</w:t>
+      </w:r>
+      <w:r>
+        <w:rPr>
+          <w:rFonts w:ascii="Arial" w:eastAsia="Arial" w:hAnsi="Arial" w:cs="Arial"/>
+          <w:color w:val="000000"/>
+        </w:rPr>
+        <w:t xml:space="preserve"> </w:t>
+      </w:r>
+      <w:r>
+        <w:rPr>
+          <w:rFonts w:ascii="Arial" w:eastAsia="Arial" w:hAnsi="Arial" w:cs="Arial"/>
+          <w:color w:val="000000"/>
+          <w:highlight w:val="white"/>
+        </w:rPr>
+        <w:t>Una donna della Samaria venne ad attingere l'acqua. Gesù le disse: “Dammi da bere”. Infatti i suoi discepoli erano andati in città a comprare da mangiare. La donna samaritana allora gli disse: “Come mai tu che sei Giudeo chiedi da bere a me, che sono una donna samaritana?”. Infatti i Giudei non hanno relazioni con i Samaritani. Gesù le rispose: “Se tu conoscessi il dono di Dio e chi è che ti dice: "Dammi da bere", tu stessa gliene avresti chiesto, ed egli ti avrebbe dato dell'acqua viva”. La donna gli disse: “Signore, tu non hai nulla per attingere, e il pozzo è profondo; da dove avresti dunque quest'acqua viva?  Sei tu più grande di Giacobbe, nostro padre, che ci diede questo pozzo e ne bevve egli stesso con i suoi figli e il suo bestiame?”. Gesù le rispose: “Chiunque beve di quest'acqua avrà di nuovo sete; ma chi beve dell'acqua che io gli darò, non avrà mai più sete; anzi, l'acqua che io gli darò diventerà in lui una fonte d'acqua che scaturisce in vita eterna”. La donna gli disse: “Signore, dammi di quest'acqua, affinché io non abbia più sete e non venga più fin qui ad attingere”.</w:t>
+      </w:r>
+      <w:bookmarkEnd w:id="1"/>
+    </w:p>
+    <w:p>
+      <w:pPr>
+        <w:spacing w:after="0" w:line="240" w:lineRule="auto"/>
+        <w:rPr>
+          <w:rFonts w:ascii="Arial" w:eastAsia="Arial" w:hAnsi="Arial" w:cs="Arial"/>
+          <w:color w:val="000000"/>
+          <w:highlight w:val="white"/>
+        </w:rPr>
+      </w:pPr>
+    </w:p>
+    <w:p>
+      <w:pPr>
+        <w:spacing w:after="0" w:line="240" w:lineRule="auto"/>
+        <w:rPr>
+          <w:rFonts w:ascii="Arial" w:eastAsia="Arial" w:hAnsi="Arial" w:cs="Arial"/>
+          <w:b/>
+          <w:bCs/>
+          <w:sz w:val="18"/>
+          <w:szCs w:val="18"/>
+        </w:rPr>
+      </w:pPr>
+      <w:r>
+        <w:rPr>
+          <w:rFonts w:ascii="Arial" w:eastAsia="Arial" w:hAnsi="Arial" w:cs="Arial"/>
+          <w:b/>
+          <w:bCs/>
+          <w:color w:val="000000"/>
+          <w:highlight w:val="white"/>
+        </w:rPr>
+        <w:t>Riflessione</w:t>
+      </w:r>
+      <w:r>
+        <w:rPr>
+          <w:rFonts w:ascii="Arial" w:eastAsia="Arial" w:hAnsi="Arial" w:cs="Arial"/>
+          <w:b/>
+          <w:bCs/>
+          <w:color w:val="000000"/>
+        </w:rPr>
+        <w:t xml:space="preserve"> del Celebrante </w:t>
+      </w:r>
+    </w:p>
+    <w:p>
+      <w:pPr>
+        <w:spacing w:after="0" w:line="240" w:lineRule="auto"/>
+        <w:rPr>
+          <w:rFonts w:ascii="Arial" w:eastAsia="Arial" w:hAnsi="Arial" w:cs="Arial"/>
+        </w:rPr>
+      </w:pPr>
+    </w:p>
+    <w:p>
+      <w:pPr>
+        <w:shd w:val="clear" w:color="auto" w:fill="FFFFFF"/>
+        <w:spacing w:after="0" w:line="240" w:lineRule="auto"/>
+        <w:rPr>
+          <w:rFonts w:ascii="Arial" w:eastAsia="Arial" w:hAnsi="Arial" w:cs="Arial"/>
+          <w:b/>
+          <w:bCs/>
+          <w:color w:val="0A0A0A"/>
+        </w:rPr>
+      </w:pPr>
+      <w:r>
+        <w:rPr>
+          <w:rFonts w:ascii="Arial" w:eastAsia="Arial" w:hAnsi="Arial" w:cs="Arial"/>
+          <w:b/>
+          <w:bCs/>
+          <w:color w:val="0A0A0A"/>
+        </w:rPr>
+        <w:t xml:space="preserve">Preghiere dei fedeli </w:t>
+      </w:r>
+    </w:p>
+    <w:p>
+      <w:pPr>
+        <w:shd w:val="clear" w:color="auto" w:fill="FFFFFF"/>
+        <w:spacing w:after="0" w:line="240" w:lineRule="auto"/>
+        <w:rPr>
+          <w:rFonts w:ascii="Arial" w:eastAsia="Arial" w:hAnsi="Arial" w:cs="Arial"/>
+          <w:b/>
+          <w:bCs/>
+          <w:color w:val="0A0A0A"/>
+        </w:rPr>
+      </w:pPr>
+    </w:p>
+    <w:p>
+      <w:pPr>
+        <w:shd w:val="clear" w:color="auto" w:fill="FFFFFF"/>
+        <w:spacing w:after="0" w:line="240" w:lineRule="auto"/>
+        <w:rPr>
+          <w:rFonts w:ascii="Arial" w:eastAsia="Arial" w:hAnsi="Arial" w:cs="Arial"/>
+          <w:b/>
+          <w:bCs/>
+          <w:color w:val="0A0A0A"/>
+        </w:rPr>
+      </w:pPr>
+      <w:r>
+        <w:rPr>
+          <w:rFonts w:ascii="Arial" w:eastAsia="Arial" w:hAnsi="Arial" w:cs="Arial"/>
+          <w:b/>
+          <w:bCs/>
+          <w:color w:val="0A0A0A"/>
+        </w:rPr>
+        <w:t>C:</w:t>
+      </w:r>
+      <w:r>
+        <w:rPr>
+          <w:rFonts w:ascii="Arial" w:eastAsia="Arial" w:hAnsi="Arial" w:cs="Arial"/>
+          <w:color w:val="0A0A0A"/>
+        </w:rPr>
+        <w:t xml:space="preserve"> Portiamo al Signore la nostra sete e le nostre ricerche e diciamo insieme: </w:t>
+      </w:r>
+      <w:r>
+        <w:rPr>
+          <w:rFonts w:ascii="Arial" w:eastAsia="Arial" w:hAnsi="Arial" w:cs="Arial"/>
+          <w:b/>
+          <w:bCs/>
+          <w:color w:val="0A0A0A"/>
+        </w:rPr>
+        <w:t>Signore, dacci dell'acqua viva.</w:t>
+      </w:r>
+    </w:p>
+    <w:p>
+      <w:pPr>
+        <w:shd w:val="clear" w:color="auto" w:fill="FFFFFF"/>
+        <w:spacing w:after="0" w:line="240" w:lineRule="auto"/>
+        <w:rPr>
+          <w:rFonts w:ascii="Arial" w:eastAsia="Arial" w:hAnsi="Arial" w:cs="Arial"/>
+          <w:b/>
+          <w:bCs/>
+          <w:color w:val="0A0A0A"/>
+        </w:rPr>
+      </w:pPr>
+    </w:p>
+    <w:p>
+      <w:pPr>
+        <w:pStyle w:val="Paragrafoelenco"/>
+        <w:numPr>
+          <w:ilvl w:val="0"/>
+          <w:numId w:val="3"/>
+        </w:numPr>
+        <w:shd w:val="clear" w:color="auto" w:fill="FFFFFF"/>
+        <w:spacing w:after="0" w:line="240" w:lineRule="auto"/>
+        <w:rPr>
+          <w:color w:val="0A0A0A"/>
+        </w:rPr>
+      </w:pPr>
+      <w:bookmarkStart w:id="2" w:name="_Hlk230687177"/>
+      <w:r>
+        <w:rPr>
+          <w:rFonts w:ascii="Arial" w:eastAsia="Arial" w:hAnsi="Arial" w:cs="Arial"/>
+          <w:color w:val="0A0A0A"/>
+        </w:rPr>
+        <w:t>Per quando cerchiamo la felicità nelle cose che passano e ci dimentichiamo di Te, preghiamo. </w:t>
+      </w:r>
+    </w:p>
+    <w:p>
+      <w:pPr>
+        <w:pStyle w:val="Paragrafoelenco"/>
+        <w:numPr>
+          <w:ilvl w:val="0"/>
+          <w:numId w:val="3"/>
+        </w:numPr>
+        <w:shd w:val="clear" w:color="auto" w:fill="FFFFFF"/>
+        <w:spacing w:after="0" w:line="240" w:lineRule="auto"/>
+        <w:rPr>
+          <w:color w:val="0A0A0A"/>
+        </w:rPr>
+      </w:pPr>
+      <w:bookmarkStart w:id="3" w:name="_Hlk230687201"/>
+      <w:bookmarkEnd w:id="2"/>
+      <w:r>
+        <w:rPr>
+          <w:rFonts w:ascii="Arial" w:eastAsia="Arial" w:hAnsi="Arial" w:cs="Arial"/>
+          <w:color w:val="0A0A0A"/>
+        </w:rPr>
+        <w:t>Per chi si sente "arido" e svuotato, perché trovi in questo campo una sorgente di amicizia, preghiamo.</w:t>
+      </w:r>
+    </w:p>
+    <w:p>
+      <w:pPr>
+        <w:pStyle w:val="Paragrafoelenco"/>
+        <w:numPr>
+          <w:ilvl w:val="0"/>
+          <w:numId w:val="3"/>
+        </w:numPr>
+        <w:shd w:val="clear" w:color="auto" w:fill="FFFFFF"/>
+        <w:spacing w:after="0" w:line="240" w:lineRule="auto"/>
+        <w:rPr>
+          <w:color w:val="0A0A0A"/>
+        </w:rPr>
+      </w:pPr>
+      <w:bookmarkStart w:id="4" w:name="_Hlk230687247"/>
+      <w:bookmarkEnd w:id="3"/>
+      <w:r>
+        <w:rPr>
+          <w:rFonts w:ascii="Arial" w:eastAsia="Arial" w:hAnsi="Arial" w:cs="Arial"/>
+          <w:color w:val="0A0A0A"/>
+        </w:rPr>
+        <w:t>Perché sappiamo cercare il bene in ogni compagno, anche in chi ci è meno simpatico, preghiamo. </w:t>
+      </w:r>
+    </w:p>
+    <w:p>
+      <w:pPr>
+        <w:pStyle w:val="Paragrafoelenco"/>
+        <w:numPr>
+          <w:ilvl w:val="0"/>
+          <w:numId w:val="3"/>
+        </w:numPr>
+        <w:shd w:val="clear" w:color="auto" w:fill="FFFFFF"/>
+        <w:spacing w:after="0" w:line="240" w:lineRule="auto"/>
+        <w:rPr>
+          <w:color w:val="0A0A0A"/>
+        </w:rPr>
+      </w:pPr>
+      <w:bookmarkStart w:id="5" w:name="OLE_LINK5"/>
+      <w:bookmarkEnd w:id="4"/>
+      <w:r>
+        <w:rPr>
+          <w:rFonts w:ascii="Arial" w:eastAsia="Arial" w:hAnsi="Arial" w:cs="Arial"/>
+          <w:color w:val="0A0A0A"/>
+        </w:rPr>
+        <w:t>Per la nostra ricerca di futuro e di sogni: guidaci Tu sulla strada giusta, preghiamo. </w:t>
+      </w:r>
+    </w:p>
+    <w:p>
+      <w:pPr>
+        <w:pStyle w:val="Paragrafoelenco"/>
+        <w:numPr>
+          <w:ilvl w:val="0"/>
+          <w:numId w:val="3"/>
+        </w:numPr>
+        <w:shd w:val="clear" w:color="auto" w:fill="FFFFFF"/>
+        <w:spacing w:after="0" w:line="240" w:lineRule="auto"/>
+        <w:rPr>
+          <w:color w:val="0A0A0A"/>
+        </w:rPr>
+      </w:pPr>
+      <w:bookmarkStart w:id="6" w:name="_Hlk230687289"/>
+      <w:bookmarkEnd w:id="5"/>
+      <w:r>
+        <w:rPr>
+          <w:rFonts w:ascii="Arial" w:eastAsia="Arial" w:hAnsi="Arial" w:cs="Arial"/>
+          <w:color w:val="0A0A0A"/>
+        </w:rPr>
+        <w:t>Per questo camposcuola e per chi</w:t>
+      </w:r>
+      <w:r>
+        <w:rPr>
+          <w:rFonts w:ascii="Arial" w:eastAsia="Arial" w:hAnsi="Arial" w:cs="Arial"/>
+          <w:color w:val="0A0A0A"/>
+        </w:rPr>
+        <w:t xml:space="preserve"> ci attende a casa, affinché il bene che vivremo in queste giornate sia condiviso con tutti quelli che incontreremo sulla nostra strada. Preghiamo.</w:t>
+      </w:r>
+    </w:p>
+    <w:bookmarkEnd w:id="6"/>
+    <w:p>
+      <w:pPr>
+        <w:shd w:val="clear" w:color="auto" w:fill="FFFFFF"/>
+        <w:tabs>
+          <w:tab w:val="left" w:pos="8505"/>
+        </w:tabs>
+        <w:spacing w:after="0" w:line="240" w:lineRule="auto"/>
+        <w:rPr>
+          <w:rFonts w:ascii="Arial" w:eastAsia="Arial" w:hAnsi="Arial" w:cs="Arial"/>
+          <w:color w:val="0A0A0A"/>
+        </w:rPr>
+      </w:pPr>
+      <w:r>
+        <w:rPr>
+          <w:rFonts w:ascii="Arial" w:eastAsia="Arial" w:hAnsi="Arial" w:cs="Arial"/>
+          <w:color w:val="0A0A0A"/>
+        </w:rPr>
+        <w:tab/>
+      </w:r>
+    </w:p>
+    <w:p>
+      <w:pPr>
+        <w:shd w:val="clear" w:color="auto" w:fill="FFFFFF"/>
+        <w:tabs>
+          <w:tab w:val="left" w:pos="8505"/>
+        </w:tabs>
+        <w:spacing w:after="0" w:line="240" w:lineRule="auto"/>
+        <w:rPr>
+          <w:rFonts w:ascii="Arial" w:eastAsia="Arial" w:hAnsi="Arial" w:cs="Arial"/>
+          <w:b/>
+          <w:bCs/>
+          <w:color w:val="0A0A0A"/>
+        </w:rPr>
+      </w:pPr>
+      <w:r>
+        <w:rPr>
+          <w:rFonts w:ascii="Arial" w:eastAsia="Arial" w:hAnsi="Arial" w:cs="Arial"/>
+          <w:b/>
+          <w:bCs/>
+          <w:color w:val="0A0A0A"/>
+        </w:rPr>
+        <w:t xml:space="preserve">Segno </w:t>
+      </w:r>
+    </w:p>
+    <w:p>
+      <w:pPr>
+        <w:shd w:val="clear" w:color="auto" w:fill="FFFFFF"/>
+        <w:tabs>
+          <w:tab w:val="left" w:pos="8505"/>
+        </w:tabs>
+        <w:spacing w:after="0" w:line="240" w:lineRule="auto"/>
+        <w:rPr>
+          <w:rFonts w:ascii="Arial" w:eastAsia="Arial" w:hAnsi="Arial" w:cs="Arial"/>
+          <w:b/>
+          <w:bCs/>
+          <w:color w:val="0A0A0A"/>
+        </w:rPr>
+      </w:pPr>
+      <w:r>
+        <w:rPr>
+          <w:rFonts w:ascii="Arial" w:eastAsia="Arial" w:hAnsi="Arial" w:cs="Arial"/>
+          <w:b/>
+          <w:bCs/>
+          <w:color w:val="0A0A0A"/>
+        </w:rPr>
+        <w:t xml:space="preserve">Ancora su cartellone – ciascun ragazzo scrive una persona che è la propria ancora nella fede o nella vita </w:t>
+      </w:r>
+    </w:p>
+    <w:p>
+      <w:pPr>
+        <w:shd w:val="clear" w:color="auto" w:fill="FFFFFF"/>
+        <w:spacing w:after="0" w:line="240" w:lineRule="auto"/>
+        <w:rPr>
+          <w:rFonts w:ascii="Arial" w:eastAsia="Arial" w:hAnsi="Arial" w:cs="Arial"/>
+          <w:b/>
+          <w:bCs/>
+          <w:color w:val="0A0A0A"/>
+        </w:rPr>
+      </w:pPr>
+    </w:p>
+    <w:p>
+      <w:pPr>
+        <w:shd w:val="clear" w:color="auto" w:fill="FFFFFF"/>
+        <w:spacing w:after="0" w:line="240" w:lineRule="auto"/>
+        <w:rPr>
+          <w:rFonts w:ascii="Arial" w:eastAsia="Arial" w:hAnsi="Arial" w:cs="Arial"/>
+          <w:b/>
+          <w:bCs/>
+          <w:color w:val="0A0A0A"/>
+        </w:rPr>
+      </w:pPr>
+      <w:r>
+        <w:rPr>
+          <w:rFonts w:ascii="Arial" w:eastAsia="Arial" w:hAnsi="Arial" w:cs="Arial"/>
+          <w:b/>
+          <w:bCs/>
+          <w:color w:val="0A0A0A"/>
+        </w:rPr>
+        <w:t>Padre Nostro</w:t>
+      </w:r>
+    </w:p>
+    <w:p>
+      <w:pPr>
+        <w:shd w:val="clear" w:color="auto" w:fill="FFFFFF"/>
+        <w:spacing w:after="0" w:line="240" w:lineRule="auto"/>
+        <w:rPr>
+          <w:rFonts w:ascii="Arial" w:eastAsia="Arial" w:hAnsi="Arial" w:cs="Arial"/>
+          <w:b/>
+          <w:bCs/>
+          <w:color w:val="0A0A0A"/>
+        </w:rPr>
+      </w:pPr>
+    </w:p>
+    <w:p>
+      <w:pPr>
+        <w:shd w:val="clear" w:color="auto" w:fill="FFFFFF"/>
+        <w:spacing w:after="0" w:line="240" w:lineRule="auto"/>
+        <w:rPr>
+          <w:rFonts w:ascii="Arial" w:eastAsia="Arial" w:hAnsi="Arial" w:cs="Arial"/>
+          <w:color w:val="0A0A0A"/>
+        </w:rPr>
+      </w:pPr>
+      <w:r>
+        <w:rPr>
+          <w:rFonts w:ascii="Arial" w:eastAsia="Arial" w:hAnsi="Arial" w:cs="Arial"/>
+          <w:b/>
+          <w:bCs/>
+          <w:color w:val="0A0A0A"/>
+        </w:rPr>
+        <w:t>C:</w:t>
+      </w:r>
+      <w:r>
+        <w:rPr>
+          <w:rFonts w:ascii="Arial" w:eastAsia="Arial" w:hAnsi="Arial" w:cs="Arial"/>
+          <w:color w:val="0A0A0A"/>
+        </w:rPr>
+        <w:t> </w:t>
+      </w:r>
+      <w:bookmarkStart w:id="7" w:name="_Hlk230687324"/>
+      <w:r>
+        <w:rPr>
+          <w:rFonts w:ascii="Arial" w:eastAsia="Arial" w:hAnsi="Arial" w:cs="Arial"/>
+          <w:color w:val="0A0A0A"/>
+        </w:rPr>
+        <w:t>Il Signore sia il vostro pozzo di acqua fresca nei momenti di stanchezza. Vi doni occhi capaci di cercarlo e cuore capace di riconoscerlo.</w:t>
+      </w:r>
+      <w:r>
+        <w:rPr>
+          <w:rFonts w:ascii="Arial" w:eastAsia="Arial" w:hAnsi="Arial" w:cs="Arial"/>
+          <w:color w:val="0A0A0A"/>
+        </w:rPr>
+        <w:br/>
+      </w:r>
+      <w:bookmarkEnd w:id="7"/>
+      <w:r>
+        <w:rPr>
+          <w:rFonts w:ascii="Arial" w:eastAsia="Arial" w:hAnsi="Arial" w:cs="Arial"/>
+          <w:b/>
+          <w:bCs/>
+          <w:color w:val="0A0A0A"/>
+        </w:rPr>
+        <w:t>T:</w:t>
+      </w:r>
+      <w:r>
+        <w:rPr>
+          <w:rFonts w:ascii="Arial" w:eastAsia="Arial" w:hAnsi="Arial" w:cs="Arial"/>
+          <w:color w:val="0A0A0A"/>
+        </w:rPr>
+        <w:t> Amen.</w:t>
+      </w:r>
+      <w:r>
+        <w:rPr>
+          <w:rFonts w:ascii="Arial" w:eastAsia="Arial" w:hAnsi="Arial" w:cs="Arial"/>
+          <w:color w:val="0A0A0A"/>
+        </w:rPr>
+        <w:br/>
+      </w:r>
+      <w:r>
+        <w:rPr>
+          <w:rFonts w:ascii="Arial" w:eastAsia="Arial" w:hAnsi="Arial" w:cs="Arial"/>
+          <w:b/>
+          <w:bCs/>
+          <w:color w:val="0A0A0A"/>
+        </w:rPr>
+        <w:t>C:</w:t>
+      </w:r>
+      <w:r>
+        <w:rPr>
+          <w:rFonts w:ascii="Arial" w:eastAsia="Arial" w:hAnsi="Arial" w:cs="Arial"/>
+          <w:color w:val="0A0A0A"/>
+        </w:rPr>
+        <w:t> E la benedizione di Dio onnipotente, Padre e Figlio e Spirito Santo, discenda su di voi e con voi rimanga sempre.</w:t>
+      </w:r>
+      <w:r>
+        <w:rPr>
+          <w:rFonts w:ascii="Arial" w:eastAsia="Arial" w:hAnsi="Arial" w:cs="Arial"/>
+          <w:color w:val="0A0A0A"/>
+        </w:rPr>
+        <w:br/>
+      </w:r>
+      <w:r>
+        <w:rPr>
+          <w:rFonts w:ascii="Arial" w:eastAsia="Arial" w:hAnsi="Arial" w:cs="Arial"/>
+          <w:b/>
+          <w:bCs/>
+          <w:color w:val="0A0A0A"/>
+        </w:rPr>
+        <w:t>T:</w:t>
+      </w:r>
+      <w:r>
+        <w:rPr>
+          <w:rFonts w:ascii="Arial" w:eastAsia="Arial" w:hAnsi="Arial" w:cs="Arial"/>
+          <w:color w:val="0A0A0A"/>
+        </w:rPr>
+        <w:t> Amen.</w:t>
+      </w:r>
+    </w:p>
+    <w:p>
+      <w:pPr>
+        <w:shd w:val="clear" w:color="auto" w:fill="FFFFFF"/>
+        <w:spacing w:after="0" w:line="240" w:lineRule="auto"/>
+        <w:rPr>
+          <w:rFonts w:ascii="Arial" w:eastAsia="Arial" w:hAnsi="Arial" w:cs="Arial"/>
+          <w:color w:val="0A0A0A"/>
+        </w:rPr>
+      </w:pPr>
+    </w:p>
+    <w:p>
+      <w:pPr>
+        <w:shd w:val="clear" w:color="auto" w:fill="FFFFFF"/>
+        <w:spacing w:after="0" w:line="240" w:lineRule="auto"/>
+        <w:rPr>
+          <w:rFonts w:ascii="Arial" w:eastAsia="Arial" w:hAnsi="Arial" w:cs="Arial"/>
+          <w:b/>
+          <w:bCs/>
+          <w:color w:val="0A0A0A"/>
+        </w:rPr>
+      </w:pPr>
+      <w:r>
+        <w:rPr>
+          <w:rFonts w:ascii="Arial" w:eastAsia="Arial" w:hAnsi="Arial" w:cs="Arial"/>
+          <w:b/>
+          <w:bCs/>
+          <w:color w:val="0A0A0A"/>
+        </w:rPr>
+        <w:t>Canto finale</w:t>
+      </w:r>
+      <w:r>
+        <w:rPr>
+          <w:rFonts w:ascii="Arial" w:eastAsia="Arial" w:hAnsi="Arial" w:cs="Arial"/>
+          <w:b/>
+          <w:bCs/>
+          <w:color w:val="0A0A0A"/>
+        </w:rPr>
+        <w:t xml:space="preserve"> </w:t>
+      </w:r>
+      <w:r>
+        <w:rPr>
+          <w:rFonts w:ascii="Arial" w:eastAsia="Arial" w:hAnsi="Arial" w:cs="Arial"/>
+          <w:b/>
+          <w:bCs/>
+          <w:color w:val="0A0A0A"/>
+        </w:rPr>
+        <w:br w:type="page"/>
+      </w:r>
+    </w:p>
+    <w:p>
+      <w:pPr>
+        <w:shd w:val="clear" w:color="auto" w:fill="FFFFFF"/>
+        <w:spacing w:after="0" w:line="240" w:lineRule="auto"/>
+        <w:rPr>
+          <w:rFonts w:ascii="Arial" w:eastAsia="Arial" w:hAnsi="Arial" w:cs="Arial"/>
+          <w:b/>
+          <w:bCs/>
+          <w:color w:val="0A0A0A"/>
+        </w:rPr>
+      </w:pPr>
+      <w:r>
+        <w:rPr>
+          <w:rFonts w:ascii="Arial" w:eastAsia="Arial" w:hAnsi="Arial" w:cs="Arial"/>
+          <w:b/>
+          <w:bCs/>
+          <w:color w:val="0A0A0A"/>
+        </w:rPr>
+        <w:lastRenderedPageBreak/>
+        <w:t xml:space="preserve">19 Agosto </w:t>
+      </w:r>
+      <w:r>
+        <w:rPr>
+          <w:rFonts w:ascii="Arial" w:eastAsia="Arial" w:hAnsi="Arial" w:cs="Arial"/>
+          <w:b/>
+          <w:bCs/>
+          <w:color w:val="0A0A0A"/>
+        </w:rPr>
+        <w:t>Mattino</w:t>
+      </w:r>
+      <w:r>
+        <w:rPr>
+          <w:rFonts w:ascii="Arial" w:eastAsia="Arial" w:hAnsi="Arial" w:cs="Arial"/>
+          <w:b/>
+          <w:bCs/>
+          <w:color w:val="0A0A0A"/>
+        </w:rPr>
+        <w:t xml:space="preserve"> </w:t>
+      </w:r>
+    </w:p>
+    <w:p>
+      <w:pPr>
+        <w:shd w:val="clear" w:color="auto" w:fill="FFFFFF"/>
+        <w:spacing w:after="0" w:line="240" w:lineRule="auto"/>
+        <w:rPr>
+          <w:rFonts w:ascii="Arial" w:eastAsia="Arial" w:hAnsi="Arial" w:cs="Arial"/>
+          <w:b/>
+          <w:bCs/>
+          <w:color w:val="0A0A0A"/>
+          <w:highlight w:val="white"/>
+        </w:rPr>
+      </w:pPr>
+    </w:p>
+    <w:p>
+      <w:pPr>
+        <w:shd w:val="clear" w:color="auto" w:fill="FFFFFF"/>
+        <w:spacing w:after="0" w:line="240" w:lineRule="auto"/>
+        <w:rPr>
+          <w:rFonts w:ascii="Arial" w:eastAsia="Arial" w:hAnsi="Arial" w:cs="Arial"/>
+          <w:b/>
+          <w:bCs/>
+          <w:color w:val="0A0A0A"/>
+          <w:highlight w:val="white"/>
+        </w:rPr>
+      </w:pPr>
+      <w:r>
+        <w:rPr>
+          <w:rFonts w:ascii="Arial" w:eastAsia="Arial" w:hAnsi="Arial" w:cs="Arial"/>
+          <w:b/>
+          <w:bCs/>
+          <w:color w:val="0A0A0A"/>
+          <w:highlight w:val="white"/>
+        </w:rPr>
+        <w:t xml:space="preserve">Canto inziale </w:t>
+      </w:r>
+    </w:p>
+    <w:p>
+      <w:pPr>
+        <w:shd w:val="clear" w:color="auto" w:fill="FFFFFF"/>
+        <w:spacing w:after="0" w:line="240" w:lineRule="auto"/>
+        <w:rPr>
+          <w:rFonts w:ascii="Arial" w:eastAsia="Arial" w:hAnsi="Arial" w:cs="Arial"/>
+          <w:b/>
+          <w:bCs/>
+          <w:color w:val="0A0A0A"/>
+          <w:highlight w:val="white"/>
+        </w:rPr>
+      </w:pPr>
+    </w:p>
+    <w:p>
+      <w:pPr>
+        <w:shd w:val="clear" w:color="auto" w:fill="FFFFFF"/>
+        <w:spacing w:after="0" w:line="240" w:lineRule="auto"/>
+        <w:rPr>
+          <w:rFonts w:ascii="Arial" w:eastAsia="Arial" w:hAnsi="Arial" w:cs="Arial"/>
+          <w:color w:val="0A0A0A"/>
+          <w:highlight w:val="white"/>
+        </w:rPr>
+      </w:pPr>
+      <w:r>
+        <w:rPr>
+          <w:rFonts w:ascii="Arial" w:eastAsia="Arial" w:hAnsi="Arial" w:cs="Arial"/>
+          <w:b/>
+          <w:bCs/>
+          <w:color w:val="0A0A0A"/>
+          <w:highlight w:val="white"/>
+        </w:rPr>
+        <w:t>C:</w:t>
+      </w:r>
+      <w:r>
+        <w:rPr>
+          <w:rFonts w:ascii="Arial" w:eastAsia="Arial" w:hAnsi="Arial" w:cs="Arial"/>
+          <w:color w:val="0A0A0A"/>
+          <w:highlight w:val="white"/>
+        </w:rPr>
+        <w:t> Nel nome del Padre, del Figlio e dello Spirito Santo.</w:t>
+      </w:r>
+      <w:r>
+        <w:rPr>
+          <w:rFonts w:ascii="Arial" w:eastAsia="Arial" w:hAnsi="Arial" w:cs="Arial"/>
+          <w:color w:val="0A0A0A"/>
+        </w:rPr>
+        <w:br/>
+      </w:r>
+      <w:r>
+        <w:rPr>
+          <w:rFonts w:ascii="Arial" w:eastAsia="Arial" w:hAnsi="Arial" w:cs="Arial"/>
+          <w:b/>
+          <w:bCs/>
+          <w:color w:val="0A0A0A"/>
+          <w:highlight w:val="white"/>
+        </w:rPr>
+        <w:t>T:</w:t>
+      </w:r>
+      <w:r>
+        <w:rPr>
+          <w:rFonts w:ascii="Arial" w:eastAsia="Arial" w:hAnsi="Arial" w:cs="Arial"/>
+          <w:color w:val="0A0A0A"/>
+          <w:highlight w:val="white"/>
+        </w:rPr>
+        <w:t> Amen.</w:t>
+      </w:r>
+      <w:r>
+        <w:rPr>
+          <w:rFonts w:ascii="Arial" w:eastAsia="Arial" w:hAnsi="Arial" w:cs="Arial"/>
+          <w:color w:val="0A0A0A"/>
+        </w:rPr>
+        <w:br/>
+      </w:r>
+      <w:r>
+        <w:rPr>
+          <w:rFonts w:ascii="Arial" w:eastAsia="Arial" w:hAnsi="Arial" w:cs="Arial"/>
+          <w:b/>
+          <w:bCs/>
+          <w:color w:val="0A0A0A"/>
+          <w:highlight w:val="white"/>
+        </w:rPr>
+        <w:t>C:</w:t>
+      </w:r>
+      <w:r>
+        <w:rPr>
+          <w:rFonts w:ascii="Arial" w:eastAsia="Arial" w:hAnsi="Arial" w:cs="Arial"/>
+          <w:color w:val="0A0A0A"/>
+          <w:highlight w:val="white"/>
+        </w:rPr>
+        <w:t> Il Signore, che ci parla nel silenzio dell’aurora e nel rumore dei nostri passi, sia con tutti voi.</w:t>
+      </w:r>
+    </w:p>
+    <w:p>
+      <w:pPr>
+        <w:shd w:val="clear" w:color="auto" w:fill="FFFFFF"/>
+        <w:spacing w:after="0" w:line="240" w:lineRule="auto"/>
+        <w:rPr>
+          <w:rFonts w:ascii="Arial" w:eastAsia="Arial" w:hAnsi="Arial" w:cs="Arial"/>
+          <w:color w:val="0A0A0A"/>
+          <w:highlight w:val="white"/>
+        </w:rPr>
+      </w:pPr>
+      <w:r>
+        <w:rPr>
+          <w:rFonts w:ascii="Arial" w:eastAsia="Arial" w:hAnsi="Arial" w:cs="Arial"/>
+          <w:b/>
+          <w:bCs/>
+          <w:color w:val="0A0A0A"/>
+          <w:highlight w:val="white"/>
+        </w:rPr>
+        <w:t>T</w:t>
+      </w:r>
+      <w:r>
+        <w:rPr>
+          <w:rFonts w:ascii="Arial" w:eastAsia="Arial" w:hAnsi="Arial" w:cs="Arial"/>
+          <w:color w:val="0A0A0A"/>
+          <w:highlight w:val="white"/>
+        </w:rPr>
+        <w:t>: E con il tuo spirito</w:t>
+      </w:r>
+      <w:r>
+        <w:rPr>
+          <w:rFonts w:ascii="Arial" w:eastAsia="Arial" w:hAnsi="Arial" w:cs="Arial"/>
+          <w:color w:val="0A0A0A"/>
+        </w:rPr>
+        <w:br/>
+      </w:r>
+      <w:r>
+        <w:rPr>
+          <w:rFonts w:ascii="Arial" w:eastAsia="Arial" w:hAnsi="Arial" w:cs="Arial"/>
+          <w:b/>
+          <w:bCs/>
+          <w:color w:val="0A0A0A"/>
+          <w:highlight w:val="white"/>
+        </w:rPr>
+        <w:t>C:</w:t>
+      </w:r>
+      <w:r>
+        <w:rPr>
+          <w:rFonts w:ascii="Arial" w:eastAsia="Arial" w:hAnsi="Arial" w:cs="Arial"/>
+          <w:color w:val="0A0A0A"/>
+          <w:highlight w:val="white"/>
+        </w:rPr>
+        <w:t> </w:t>
+      </w:r>
+      <w:bookmarkStart w:id="8" w:name="_Hlk230687425"/>
+      <w:r>
+        <w:rPr>
+          <w:rFonts w:ascii="Arial" w:eastAsia="Arial" w:hAnsi="Arial" w:cs="Arial"/>
+          <w:color w:val="0A0A0A"/>
+          <w:highlight w:val="white"/>
+        </w:rPr>
+        <w:t>Buongiorno! Spesso pensiamo che ascoltare significhi solo 'sentire' dei suoni. Ma l'ascolto vero è un'arte: è fare spazio a qualcuno dentro di noi. Oggi il campo ci sfida a questo: ascoltare il compagno di stanza, ascoltare il bosco, ascoltare la voce di Dio che ci sussurra che siamo amati. Iniziamo la giornata chiedendo il dono di un ascolto attento.</w:t>
+      </w:r>
+    </w:p>
+    <w:bookmarkEnd w:id="8"/>
+    <w:p>
+      <w:pPr>
+        <w:shd w:val="clear" w:color="auto" w:fill="FFFFFF"/>
+        <w:spacing w:after="0" w:line="240" w:lineRule="auto"/>
+        <w:rPr>
+          <w:rFonts w:ascii="Arial" w:eastAsia="Arial" w:hAnsi="Arial" w:cs="Arial"/>
+          <w:color w:val="0A0A0A"/>
+          <w:highlight w:val="white"/>
+        </w:rPr>
+      </w:pPr>
+    </w:p>
+    <w:p>
+      <w:pPr>
+        <w:spacing w:after="0" w:line="240" w:lineRule="auto"/>
+        <w:rPr>
+          <w:rFonts w:ascii="Arial" w:eastAsia="Arial" w:hAnsi="Arial" w:cs="Arial"/>
+          <w:b/>
+          <w:bCs/>
+          <w:color w:val="0A0A0A"/>
+          <w:highlight w:val="white"/>
+        </w:rPr>
+      </w:pPr>
+      <w:r>
+        <w:rPr>
+          <w:rFonts w:ascii="Arial" w:eastAsia="Arial" w:hAnsi="Arial" w:cs="Arial"/>
+          <w:b/>
+          <w:bCs/>
+          <w:color w:val="0A0A0A"/>
+          <w:highlight w:val="white"/>
+        </w:rPr>
+        <w:t xml:space="preserve">Salmo </w:t>
+      </w:r>
+      <w:r>
+        <w:rPr>
+          <w:rFonts w:ascii="Arial" w:eastAsia="Arial" w:hAnsi="Arial" w:cs="Arial"/>
+          <w:b/>
+          <w:bCs/>
+          <w:color w:val="0A0A0A"/>
+          <w:highlight w:val="white"/>
+        </w:rPr>
+        <w:t>16</w:t>
+      </w:r>
+    </w:p>
+    <w:p>
+      <w:pPr>
+        <w:shd w:val="clear" w:color="auto" w:fill="FFFFFF"/>
+        <w:spacing w:after="0" w:line="240" w:lineRule="auto"/>
+        <w:rPr>
+          <w:rFonts w:ascii="Arial" w:eastAsia="Arial" w:hAnsi="Arial" w:cs="Arial"/>
+        </w:rPr>
+      </w:pPr>
+    </w:p>
+    <w:p>
+      <w:pPr>
+        <w:shd w:val="clear" w:color="auto" w:fill="FFFFFF"/>
+        <w:spacing w:after="0" w:line="240" w:lineRule="auto"/>
+        <w:rPr>
+          <w:rFonts w:ascii="Arial" w:eastAsia="Arial" w:hAnsi="Arial" w:cs="Arial"/>
+        </w:rPr>
+      </w:pPr>
+      <w:bookmarkStart w:id="9" w:name="OLE_LINK6"/>
+      <w:r>
+        <w:rPr>
+          <w:rFonts w:ascii="Arial" w:eastAsia="Arial" w:hAnsi="Arial" w:cs="Arial"/>
+        </w:rPr>
+        <w:t>Preservami, o Dio, perché io confido in te.</w:t>
+      </w:r>
+      <w:r>
+        <w:rPr>
+          <w:rFonts w:ascii="Arial" w:eastAsia="Arial" w:hAnsi="Arial" w:cs="Arial"/>
+        </w:rPr>
+        <w:br/>
+        <w:t>Io ho detto all'Eterno: “Tu sei il mio Signore;</w:t>
+      </w:r>
+      <w:r>
+        <w:rPr>
+          <w:rFonts w:ascii="Arial" w:eastAsia="Arial" w:hAnsi="Arial" w:cs="Arial"/>
+        </w:rPr>
+        <w:br/>
+        <w:t>io non ho altro bene all'infuori di te”;</w:t>
+      </w:r>
+      <w:r>
+        <w:rPr>
+          <w:rFonts w:ascii="Arial" w:eastAsia="Arial" w:hAnsi="Arial" w:cs="Arial"/>
+        </w:rPr>
+        <w:br/>
+      </w:r>
+    </w:p>
+    <w:p>
+      <w:pPr>
+        <w:shd w:val="clear" w:color="auto" w:fill="FFFFFF"/>
+        <w:spacing w:after="0" w:line="240" w:lineRule="auto"/>
+        <w:rPr>
+          <w:rFonts w:ascii="Arial" w:eastAsia="Arial" w:hAnsi="Arial" w:cs="Arial"/>
+        </w:rPr>
+      </w:pPr>
+      <w:r>
+        <w:rPr>
+          <w:rFonts w:ascii="Arial" w:eastAsia="Arial" w:hAnsi="Arial" w:cs="Arial"/>
+        </w:rPr>
+        <w:t>e quanto ai santi che sono in terra</w:t>
+      </w:r>
+      <w:r>
+        <w:rPr>
+          <w:rFonts w:ascii="Arial" w:eastAsia="Arial" w:hAnsi="Arial" w:cs="Arial"/>
+        </w:rPr>
+        <w:br/>
+        <w:t>essi sono la gente onorata in cui ripongo tutto il mio affetto.</w:t>
+      </w:r>
+      <w:r>
+        <w:rPr>
+          <w:rFonts w:ascii="Arial" w:eastAsia="Arial" w:hAnsi="Arial" w:cs="Arial"/>
+        </w:rPr>
+        <w:br/>
+        <w:t>I dolori di quelli che corrono dietro ad altri dèi</w:t>
+      </w:r>
+      <w:r>
+        <w:rPr>
+          <w:rFonts w:ascii="Arial" w:eastAsia="Arial" w:hAnsi="Arial" w:cs="Arial"/>
+        </w:rPr>
+        <w:br/>
+        <w:t>saranno moltiplicati;</w:t>
+      </w:r>
+      <w:r>
+        <w:rPr>
+          <w:rFonts w:ascii="Arial" w:eastAsia="Arial" w:hAnsi="Arial" w:cs="Arial"/>
+        </w:rPr>
+        <w:br/>
+        <w:t>io non offrirò le loro libazioni di sangue,</w:t>
+      </w:r>
+      <w:r>
+        <w:rPr>
+          <w:rFonts w:ascii="Arial" w:eastAsia="Arial" w:hAnsi="Arial" w:cs="Arial"/>
+        </w:rPr>
+        <w:br/>
+        <w:t>né le mie labbra proferiranno i loro nomi.</w:t>
+      </w:r>
+      <w:r>
+        <w:rPr>
+          <w:rFonts w:ascii="Arial" w:eastAsia="Arial" w:hAnsi="Arial" w:cs="Arial"/>
+        </w:rPr>
+        <w:br/>
+      </w:r>
+    </w:p>
+    <w:p>
+      <w:pPr>
+        <w:shd w:val="clear" w:color="auto" w:fill="FFFFFF"/>
+        <w:spacing w:after="0" w:line="240" w:lineRule="auto"/>
+        <w:rPr>
+          <w:rFonts w:ascii="Arial" w:eastAsia="Arial" w:hAnsi="Arial" w:cs="Arial"/>
+        </w:rPr>
+      </w:pPr>
+      <w:r>
+        <w:rPr>
+          <w:rFonts w:ascii="Arial" w:eastAsia="Arial" w:hAnsi="Arial" w:cs="Arial"/>
+        </w:rPr>
+        <w:t>L'Eterno è la mia parte di eredità e il mio calice;</w:t>
+      </w:r>
+      <w:r>
+        <w:rPr>
+          <w:rFonts w:ascii="Arial" w:eastAsia="Arial" w:hAnsi="Arial" w:cs="Arial"/>
+        </w:rPr>
+        <w:br/>
+        <w:t>tu mantieni quel che m'è toccato in sorte.</w:t>
+      </w:r>
+      <w:r>
+        <w:rPr>
+          <w:rFonts w:ascii="Arial" w:eastAsia="Arial" w:hAnsi="Arial" w:cs="Arial"/>
+        </w:rPr>
+        <w:br/>
+        <w:t>La sorte è caduta per me in luoghi dilettevoli;</w:t>
+      </w:r>
+      <w:r>
+        <w:rPr>
+          <w:rFonts w:ascii="Arial" w:eastAsia="Arial" w:hAnsi="Arial" w:cs="Arial"/>
+        </w:rPr>
+        <w:br/>
+        <w:t>una bella eredità mi è pur toccata!</w:t>
+      </w:r>
+      <w:r>
+        <w:rPr>
+          <w:rFonts w:ascii="Arial" w:eastAsia="Arial" w:hAnsi="Arial" w:cs="Arial"/>
+        </w:rPr>
+        <w:br/>
+      </w:r>
+    </w:p>
+    <w:p>
+      <w:pPr>
+        <w:shd w:val="clear" w:color="auto" w:fill="FFFFFF"/>
+        <w:spacing w:after="0" w:line="240" w:lineRule="auto"/>
+        <w:rPr>
+          <w:rFonts w:ascii="Arial" w:eastAsia="Arial" w:hAnsi="Arial" w:cs="Arial"/>
+        </w:rPr>
+      </w:pPr>
+      <w:r>
+        <w:rPr>
+          <w:rFonts w:ascii="Arial" w:eastAsia="Arial" w:hAnsi="Arial" w:cs="Arial"/>
+        </w:rPr>
+        <w:t>Io benedirò l'Eterno che mi consiglia;</w:t>
+      </w:r>
+      <w:r>
+        <w:rPr>
+          <w:rFonts w:ascii="Arial" w:eastAsia="Arial" w:hAnsi="Arial" w:cs="Arial"/>
+        </w:rPr>
+        <w:br/>
+        <w:t>anche la notte le mie reni mi ammaestrano.</w:t>
+      </w:r>
+      <w:r>
+        <w:rPr>
+          <w:rFonts w:ascii="Arial" w:eastAsia="Arial" w:hAnsi="Arial" w:cs="Arial"/>
+        </w:rPr>
+        <w:br/>
+        <w:t>Io ho sempre posto l'Eterno davanti agli occhi miei;</w:t>
+      </w:r>
+      <w:r>
+        <w:rPr>
+          <w:rFonts w:ascii="Arial" w:eastAsia="Arial" w:hAnsi="Arial" w:cs="Arial"/>
+        </w:rPr>
+        <w:br/>
+        <w:t>poiché egli è alla mia destra, io non sarò affatto smosso.</w:t>
+      </w:r>
+      <w:r>
+        <w:rPr>
+          <w:rFonts w:ascii="Arial" w:eastAsia="Arial" w:hAnsi="Arial" w:cs="Arial"/>
+        </w:rPr>
+        <w:br/>
+      </w:r>
+    </w:p>
+    <w:p>
+      <w:pPr>
+        <w:shd w:val="clear" w:color="auto" w:fill="FFFFFF"/>
+        <w:spacing w:after="0" w:line="240" w:lineRule="auto"/>
+        <w:rPr>
+          <w:rFonts w:ascii="Arial" w:eastAsia="Arial" w:hAnsi="Arial" w:cs="Arial"/>
+        </w:rPr>
+      </w:pPr>
+      <w:r>
+        <w:rPr>
+          <w:rFonts w:ascii="Arial" w:eastAsia="Arial" w:hAnsi="Arial" w:cs="Arial"/>
+        </w:rPr>
+        <w:t>Perciò il mio cuore si rallegra e l'anima mia festeggia;</w:t>
+      </w:r>
+      <w:r>
+        <w:rPr>
+          <w:rFonts w:ascii="Arial" w:eastAsia="Arial" w:hAnsi="Arial" w:cs="Arial"/>
+        </w:rPr>
+        <w:br/>
+        <w:t>anche la mia carne dimorerà al sicuro;</w:t>
+      </w:r>
+      <w:r>
+        <w:rPr>
+          <w:rFonts w:ascii="Arial" w:eastAsia="Arial" w:hAnsi="Arial" w:cs="Arial"/>
+        </w:rPr>
+        <w:br/>
+        <w:t>poiché tu non abbandonerai l'anima mia in potere della morte,</w:t>
+      </w:r>
+      <w:r>
+        <w:rPr>
+          <w:rFonts w:ascii="Arial" w:eastAsia="Arial" w:hAnsi="Arial" w:cs="Arial"/>
+        </w:rPr>
+        <w:br/>
+        <w:t>né permetterai che il tuo santo veda la fossa.</w:t>
+      </w:r>
+      <w:r>
+        <w:rPr>
+          <w:rFonts w:ascii="Arial" w:eastAsia="Arial" w:hAnsi="Arial" w:cs="Arial"/>
+        </w:rPr>
+        <w:br/>
+      </w:r>
+    </w:p>
+    <w:p>
+      <w:pPr>
+        <w:shd w:val="clear" w:color="auto" w:fill="FFFFFF"/>
+        <w:spacing w:after="0" w:line="240" w:lineRule="auto"/>
+        <w:rPr>
+          <w:rFonts w:ascii="Arial" w:eastAsia="Arial" w:hAnsi="Arial" w:cs="Arial"/>
+        </w:rPr>
+      </w:pPr>
+      <w:r>
+        <w:rPr>
+          <w:rFonts w:ascii="Arial" w:eastAsia="Arial" w:hAnsi="Arial" w:cs="Arial"/>
+        </w:rPr>
+        <w:t>Tu mi mostrerai il sentiero della vita;</w:t>
+      </w:r>
+      <w:r>
+        <w:rPr>
+          <w:rFonts w:ascii="Arial" w:eastAsia="Arial" w:hAnsi="Arial" w:cs="Arial"/>
+        </w:rPr>
+        <w:br/>
+        <w:t>vi sono gioie a sazietà alla tua presenza;</w:t>
+      </w:r>
+      <w:r>
+        <w:rPr>
+          <w:rFonts w:ascii="Arial" w:eastAsia="Arial" w:hAnsi="Arial" w:cs="Arial"/>
+        </w:rPr>
+        <w:br/>
+        <w:t>vi sono delizie alla tua destra in eterno.</w:t>
+      </w:r>
+    </w:p>
+    <w:bookmarkEnd w:id="9"/>
+    <w:p>
+      <w:pPr>
+        <w:spacing w:after="0" w:line="240" w:lineRule="auto"/>
+        <w:rPr>
+          <w:rFonts w:ascii="Arial" w:eastAsia="Arial" w:hAnsi="Arial" w:cs="Arial"/>
+          <w:b/>
+          <w:bCs/>
+          <w:color w:val="0A0A0A"/>
+          <w:highlight w:val="white"/>
+        </w:rPr>
+      </w:pPr>
+    </w:p>
+    <w:p>
+      <w:pPr>
+        <w:spacing w:after="0" w:line="240" w:lineRule="auto"/>
+        <w:rPr>
+          <w:rFonts w:ascii="Arial" w:eastAsia="Arial" w:hAnsi="Arial" w:cs="Arial"/>
+          <w:b/>
+          <w:bCs/>
+          <w:color w:val="0A0A0A"/>
+          <w:highlight w:val="white"/>
         </w:rPr>
         <w:sectPr>
           <w:type w:val="continuous"/>
@@ -975,1438 +2537,6 @@
       <w:r>
         <w:rPr>
           <w:rFonts w:ascii="Arial" w:eastAsia="Arial" w:hAnsi="Arial" w:cs="Arial"/>
-        </w:rPr>
-        <w:t>Perché ti rattristi, anima mia,</w:t>
-      </w:r>
-      <w:r>
-        <w:rPr>
-          <w:rFonts w:ascii="Arial" w:eastAsia="Arial" w:hAnsi="Arial" w:cs="Arial"/>
-        </w:rPr>
-        <w:br/>
-        <w:t>perché ti agiti in me?</w:t>
-      </w:r>
-      <w:r>
-        <w:rPr>
-          <w:rFonts w:ascii="Arial" w:eastAsia="Arial" w:hAnsi="Arial" w:cs="Arial"/>
-        </w:rPr>
-        <w:br/>
-        <w:t>Spera in Dio: ancora potrò lodarlo,</w:t>
-      </w:r>
-      <w:r>
-        <w:rPr>
-          <w:rFonts w:ascii="Arial" w:eastAsia="Arial" w:hAnsi="Arial" w:cs="Arial"/>
-        </w:rPr>
-        <w:br/>
-        <w:t>lui, salvezza del mio volto e mio Dio</w:t>
-      </w:r>
-    </w:p>
-    <w:p>
-      <w:pPr>
-        <w:spacing w:after="0" w:line="240" w:lineRule="auto"/>
-        <w:rPr>
-          <w:rFonts w:ascii="Arial" w:eastAsia="Arial" w:hAnsi="Arial" w:cs="Arial"/>
-        </w:rPr>
-        <w:sectPr>
-          <w:type w:val="continuous"/>
-          <w:pgSz w:w="11906" w:h="16838"/>
-          <w:pgMar w:top="1417" w:right="1134" w:bottom="1134" w:left="1134" w:header="708" w:footer="708" w:gutter="0"/>
-          <w:cols w:space="720"/>
-        </w:sectPr>
-      </w:pPr>
-    </w:p>
-    <w:p>
-      <w:pPr>
-        <w:spacing w:after="0" w:line="240" w:lineRule="auto"/>
-        <w:rPr>
-          <w:rFonts w:ascii="Arial" w:eastAsia="Arial" w:hAnsi="Arial" w:cs="Arial"/>
-          <w:b/>
-          <w:bCs/>
-          <w:color w:val="0A0A0A"/>
-          <w:highlight w:val="white"/>
-        </w:rPr>
-        <w:sectPr>
-          <w:type w:val="continuous"/>
-          <w:pgSz w:w="11906" w:h="16838"/>
-          <w:pgMar w:top="1417" w:right="1134" w:bottom="1134" w:left="1134" w:header="708" w:footer="708" w:gutter="0"/>
-          <w:cols w:space="720"/>
-        </w:sectPr>
-      </w:pPr>
-      <w:r>
-        <w:rPr>
-          <w:rFonts w:ascii="Arial" w:eastAsia="Arial" w:hAnsi="Arial" w:cs="Arial"/>
-          <w:b/>
-          <w:bCs/>
-          <w:color w:val="0A0A0A"/>
-          <w:highlight w:val="white"/>
-        </w:rPr>
-        <w:t xml:space="preserve">T: </w:t>
-      </w:r>
-      <w:r>
-        <w:rPr>
-          <w:rFonts w:ascii="Arial" w:eastAsia="Arial" w:hAnsi="Arial" w:cs="Arial"/>
-          <w:color w:val="0A0A0A"/>
-          <w:highlight w:val="white"/>
-        </w:rPr>
-        <w:t>Gloria al Padre al Figlio e allo Spirito Santo</w:t>
-      </w:r>
-      <w:r>
-        <w:rPr>
-          <w:rFonts w:ascii="Arial" w:eastAsia="Arial" w:hAnsi="Arial" w:cs="Arial"/>
-          <w:b/>
-          <w:bCs/>
-          <w:color w:val="0A0A0A"/>
-          <w:highlight w:val="white"/>
-        </w:rPr>
-        <w:t xml:space="preserve">, </w:t>
-      </w:r>
-      <w:r>
-        <w:rPr>
-          <w:rFonts w:ascii="Arial" w:eastAsia="Arial" w:hAnsi="Arial" w:cs="Arial"/>
-          <w:color w:val="0A0A0A"/>
-          <w:highlight w:val="white"/>
-        </w:rPr>
-        <w:t>come era nel principio</w:t>
-      </w:r>
-      <w:r>
-        <w:rPr>
-          <w:rFonts w:ascii="Arial" w:eastAsia="Arial" w:hAnsi="Arial" w:cs="Arial"/>
-          <w:color w:val="0A0A0A"/>
-          <w:highlight w:val="white"/>
-        </w:rPr>
-        <w:t>,</w:t>
-      </w:r>
-      <w:r>
-        <w:rPr>
-          <w:rFonts w:ascii="Arial" w:eastAsia="Arial" w:hAnsi="Arial" w:cs="Arial"/>
-          <w:color w:val="0A0A0A"/>
-          <w:highlight w:val="white"/>
-        </w:rPr>
-        <w:t xml:space="preserve"> ora e sempre nei secoli dei secoli. Amen.</w:t>
-      </w:r>
-    </w:p>
-    <w:p>
-      <w:pPr>
-        <w:spacing w:after="0" w:line="240" w:lineRule="auto"/>
-        <w:rPr>
-          <w:rFonts w:ascii="Arial" w:eastAsia="Arial" w:hAnsi="Arial" w:cs="Arial"/>
-        </w:rPr>
-      </w:pPr>
-    </w:p>
-    <w:p>
-      <w:pPr>
-        <w:spacing w:after="0" w:line="240" w:lineRule="auto"/>
-        <w:rPr>
-          <w:rFonts w:ascii="Arial" w:eastAsia="Arial" w:hAnsi="Arial" w:cs="Arial"/>
-          <w:b/>
-          <w:bCs/>
-          <w:color w:val="0A0A0A"/>
-          <w:highlight w:val="white"/>
-        </w:rPr>
-      </w:pPr>
-    </w:p>
-    <w:p>
-      <w:pPr>
-        <w:spacing w:after="0" w:line="240" w:lineRule="auto"/>
-        <w:rPr>
-          <w:rFonts w:ascii="Arial" w:eastAsia="Arial" w:hAnsi="Arial" w:cs="Arial"/>
-          <w:b/>
-          <w:bCs/>
-          <w:color w:val="0A0A0A"/>
-          <w:highlight w:val="white"/>
-        </w:rPr>
-      </w:pPr>
-    </w:p>
-    <w:p>
-      <w:pPr>
-        <w:spacing w:after="0" w:line="240" w:lineRule="auto"/>
-        <w:rPr>
-          <w:rFonts w:ascii="Arial" w:eastAsia="Arial" w:hAnsi="Arial" w:cs="Arial"/>
-          <w:b/>
-          <w:bCs/>
-          <w:color w:val="0A0A0A"/>
-          <w:highlight w:val="white"/>
-        </w:rPr>
-      </w:pPr>
-    </w:p>
-    <w:p>
-      <w:pPr>
-        <w:spacing w:after="0" w:line="240" w:lineRule="auto"/>
-        <w:rPr>
-          <w:rFonts w:ascii="Arial" w:eastAsia="Arial" w:hAnsi="Arial" w:cs="Arial"/>
-          <w:b/>
-          <w:bCs/>
-          <w:color w:val="0A0A0A"/>
-          <w:highlight w:val="white"/>
-        </w:rPr>
-      </w:pPr>
-    </w:p>
-    <w:p>
-      <w:pPr>
-        <w:spacing w:after="0" w:line="240" w:lineRule="auto"/>
-        <w:rPr>
-          <w:rFonts w:ascii="Arial" w:eastAsia="Arial" w:hAnsi="Arial" w:cs="Arial"/>
-          <w:b/>
-          <w:bCs/>
-          <w:color w:val="0A0A0A"/>
-          <w:highlight w:val="white"/>
-        </w:rPr>
-      </w:pPr>
-    </w:p>
-    <w:p>
-      <w:pPr>
-        <w:spacing w:after="0" w:line="240" w:lineRule="auto"/>
-        <w:rPr>
-          <w:rFonts w:ascii="Arial" w:eastAsia="Arial" w:hAnsi="Arial" w:cs="Arial"/>
-          <w:b/>
-          <w:bCs/>
-          <w:color w:val="0A0A0A"/>
-          <w:highlight w:val="white"/>
-        </w:rPr>
-      </w:pPr>
-    </w:p>
-    <w:p>
-      <w:pPr>
-        <w:spacing w:after="0" w:line="240" w:lineRule="auto"/>
-        <w:rPr>
-          <w:rFonts w:ascii="Arial" w:eastAsia="Arial" w:hAnsi="Arial" w:cs="Arial"/>
-          <w:b/>
-          <w:bCs/>
-          <w:color w:val="0A0A0A"/>
-          <w:highlight w:val="white"/>
-        </w:rPr>
-      </w:pPr>
-    </w:p>
-    <w:p>
-      <w:pPr>
-        <w:spacing w:after="0" w:line="240" w:lineRule="auto"/>
-        <w:rPr>
-          <w:rFonts w:ascii="Arial" w:eastAsia="Arial" w:hAnsi="Arial" w:cs="Arial"/>
-          <w:b/>
-          <w:bCs/>
-          <w:color w:val="0A0A0A"/>
-          <w:highlight w:val="white"/>
-        </w:rPr>
-      </w:pPr>
-    </w:p>
-    <w:p>
-      <w:pPr>
-        <w:spacing w:after="0" w:line="240" w:lineRule="auto"/>
-        <w:rPr>
-          <w:rFonts w:ascii="Arial" w:eastAsia="Arial" w:hAnsi="Arial" w:cs="Arial"/>
-          <w:b/>
-          <w:bCs/>
-          <w:color w:val="0A0A0A"/>
-          <w:highlight w:val="white"/>
-        </w:rPr>
-      </w:pPr>
-    </w:p>
-    <w:p>
-      <w:pPr>
-        <w:spacing w:after="0" w:line="240" w:lineRule="auto"/>
-        <w:rPr>
-          <w:rFonts w:ascii="Arial" w:eastAsia="Arial" w:hAnsi="Arial" w:cs="Arial"/>
-          <w:b/>
-          <w:bCs/>
-          <w:color w:val="0A0A0A"/>
-          <w:highlight w:val="white"/>
-        </w:rPr>
-      </w:pPr>
-    </w:p>
-    <w:p>
-      <w:pPr>
-        <w:spacing w:after="0" w:line="240" w:lineRule="auto"/>
-        <w:rPr>
-          <w:rFonts w:ascii="Arial" w:eastAsia="Arial" w:hAnsi="Arial" w:cs="Arial"/>
-          <w:b/>
-          <w:bCs/>
-          <w:color w:val="0A0A0A"/>
-          <w:highlight w:val="white"/>
-        </w:rPr>
-      </w:pPr>
-    </w:p>
-    <w:p>
-      <w:pPr>
-        <w:spacing w:after="0" w:line="240" w:lineRule="auto"/>
-        <w:rPr>
-          <w:rFonts w:ascii="Arial" w:eastAsia="Arial" w:hAnsi="Arial" w:cs="Arial"/>
-          <w:b/>
-          <w:bCs/>
-          <w:color w:val="0A0A0A"/>
-          <w:highlight w:val="white"/>
-        </w:rPr>
-      </w:pPr>
-      <w:r>
-        <w:rPr>
-          <w:rFonts w:ascii="Arial" w:eastAsia="Arial" w:hAnsi="Arial" w:cs="Arial"/>
-          <w:b/>
-          <w:bCs/>
-          <w:color w:val="0A0A0A"/>
-          <w:highlight w:val="white"/>
-        </w:rPr>
-        <w:lastRenderedPageBreak/>
-        <w:t>Vangelo secondo Giovanni (</w:t>
-      </w:r>
-      <w:proofErr w:type="spellStart"/>
-      <w:r>
-        <w:rPr>
-          <w:rFonts w:ascii="Arial" w:eastAsia="Arial" w:hAnsi="Arial" w:cs="Arial"/>
-          <w:b/>
-          <w:bCs/>
-          <w:color w:val="0A0A0A"/>
-          <w:highlight w:val="white"/>
-        </w:rPr>
-        <w:t>Gv</w:t>
-      </w:r>
-      <w:proofErr w:type="spellEnd"/>
-      <w:r>
-        <w:rPr>
-          <w:rFonts w:ascii="Arial" w:eastAsia="Arial" w:hAnsi="Arial" w:cs="Arial"/>
-          <w:b/>
-          <w:bCs/>
-          <w:color w:val="0A0A0A"/>
-          <w:highlight w:val="white"/>
-        </w:rPr>
-        <w:t xml:space="preserve"> 4, 5-15)</w:t>
-      </w:r>
-    </w:p>
-    <w:p>
-      <w:pPr>
-        <w:spacing w:after="0" w:line="240" w:lineRule="auto"/>
-        <w:rPr>
-          <w:rFonts w:ascii="Arial" w:eastAsia="Arial" w:hAnsi="Arial" w:cs="Arial"/>
-          <w:b/>
-          <w:bCs/>
-          <w:color w:val="0A0A0A"/>
-          <w:highlight w:val="white"/>
-        </w:rPr>
-      </w:pPr>
-    </w:p>
-    <w:p>
-      <w:pPr>
-        <w:spacing w:after="0" w:line="240" w:lineRule="auto"/>
-        <w:rPr>
-          <w:rFonts w:ascii="Arial" w:eastAsia="Arial" w:hAnsi="Arial" w:cs="Arial"/>
-          <w:b/>
-          <w:bCs/>
-          <w:color w:val="0A0A0A"/>
-          <w:highlight w:val="white"/>
-        </w:rPr>
-      </w:pPr>
-    </w:p>
-    <w:p>
-      <w:pPr>
-        <w:spacing w:after="0" w:line="240" w:lineRule="auto"/>
-        <w:rPr>
-          <w:rFonts w:ascii="Arial" w:eastAsia="Arial" w:hAnsi="Arial" w:cs="Arial"/>
-          <w:b/>
-          <w:bCs/>
-          <w:color w:val="0A0A0A"/>
-          <w:highlight w:val="white"/>
-        </w:rPr>
-        <w:sectPr>
-          <w:type w:val="continuous"/>
-          <w:pgSz w:w="11906" w:h="16838"/>
-          <w:pgMar w:top="1417" w:right="1134" w:bottom="1134" w:left="1134" w:header="708" w:footer="708" w:gutter="0"/>
-          <w:cols w:num="2" w:space="720" w:equalWidth="0">
-            <w:col w:w="4464" w:space="708"/>
-            <w:col w:w="4464" w:space="0"/>
-          </w:cols>
-        </w:sectPr>
-      </w:pPr>
-    </w:p>
-    <w:p>
-      <w:pPr>
-        <w:spacing w:after="0" w:line="240" w:lineRule="auto"/>
-        <w:rPr>
-          <w:rFonts w:ascii="Arial" w:eastAsia="Arial" w:hAnsi="Arial" w:cs="Arial"/>
-          <w:color w:val="000000"/>
-          <w:highlight w:val="white"/>
-        </w:rPr>
-      </w:pPr>
-      <w:r>
-        <w:rPr>
-          <w:rFonts w:ascii="Arial" w:eastAsia="Arial" w:hAnsi="Arial" w:cs="Arial"/>
-          <w:color w:val="000000"/>
-          <w:highlight w:val="white"/>
-        </w:rPr>
-        <w:t xml:space="preserve">Giunse dunque a una città della Samaria, chiamata </w:t>
-      </w:r>
-      <w:proofErr w:type="spellStart"/>
-      <w:r>
-        <w:rPr>
-          <w:rFonts w:ascii="Arial" w:eastAsia="Arial" w:hAnsi="Arial" w:cs="Arial"/>
-          <w:color w:val="000000"/>
-          <w:highlight w:val="white"/>
-        </w:rPr>
-        <w:t>Sicar</w:t>
-      </w:r>
-      <w:proofErr w:type="spellEnd"/>
-      <w:r>
-        <w:rPr>
-          <w:rFonts w:ascii="Arial" w:eastAsia="Arial" w:hAnsi="Arial" w:cs="Arial"/>
-          <w:color w:val="000000"/>
-          <w:highlight w:val="white"/>
-        </w:rPr>
-        <w:t>, vicina al podere che Giacobbe aveva dato a suo figlio Giuseppe; e là c'era la fonte di Giacobbe. Gesù dunque, stanco del cammino, stava così a sedere presso la fonte. Era circa l'ora sesta.</w:t>
-      </w:r>
-      <w:r>
-        <w:rPr>
-          <w:rFonts w:ascii="Arial" w:eastAsia="Arial" w:hAnsi="Arial" w:cs="Arial"/>
-          <w:color w:val="000000"/>
-        </w:rPr>
-        <w:t xml:space="preserve"> </w:t>
-      </w:r>
-      <w:r>
-        <w:rPr>
-          <w:rFonts w:ascii="Arial" w:eastAsia="Arial" w:hAnsi="Arial" w:cs="Arial"/>
-          <w:color w:val="000000"/>
-          <w:highlight w:val="white"/>
-        </w:rPr>
-        <w:t>Una donna della Samaria venne ad attingere l'acqua. Gesù le disse: “Dammi da bere”. Infatti i suoi discepoli erano andati in città a comprare da mangiare. La donna samaritana allora gli disse: “Come mai tu che sei Giudeo chiedi da bere a me, che sono una donna samaritana?”. Infatti i Giudei non hanno relazioni con i Samaritani. Gesù le rispose: “Se tu conoscessi il dono di Dio e chi è che ti dice: "Dammi da bere", tu stessa gliene avresti chiesto, ed egli ti avrebbe dato dell'acqua viva”. La donna gli disse: “Signore, tu non hai nulla per attingere, e il pozzo è profondo; da dove avresti dunque quest'acqua viva?  Sei tu più grande di Giacobbe, nostro padre, che ci diede questo pozzo e ne bevve egli stesso con i suoi figli e il suo bestiame?”. Gesù le rispose: “Chiunque beve di quest'acqua avrà di nuovo sete; ma chi beve dell'acqua che io gli darò, non avrà mai più sete; anzi, l'acqua che io gli darò diventerà in lui una fonte d'acqua che scaturisce in vita eterna”. La donna gli disse: “Signore, dammi di quest'acqua, affinché io non abbia più sete e non venga più fin qui ad attingere”.</w:t>
-      </w:r>
-    </w:p>
-    <w:p>
-      <w:pPr>
-        <w:spacing w:after="0" w:line="240" w:lineRule="auto"/>
-        <w:rPr>
-          <w:rFonts w:ascii="Arial" w:eastAsia="Arial" w:hAnsi="Arial" w:cs="Arial"/>
-          <w:color w:val="000000"/>
-          <w:highlight w:val="white"/>
-        </w:rPr>
-      </w:pPr>
-    </w:p>
-    <w:p>
-      <w:pPr>
-        <w:spacing w:after="0" w:line="240" w:lineRule="auto"/>
-        <w:rPr>
-          <w:rFonts w:ascii="Arial" w:eastAsia="Arial" w:hAnsi="Arial" w:cs="Arial"/>
-          <w:b/>
-          <w:bCs/>
-          <w:sz w:val="18"/>
-          <w:szCs w:val="18"/>
-        </w:rPr>
-      </w:pPr>
-      <w:r>
-        <w:rPr>
-          <w:rFonts w:ascii="Arial" w:eastAsia="Arial" w:hAnsi="Arial" w:cs="Arial"/>
-          <w:b/>
-          <w:bCs/>
-          <w:color w:val="000000"/>
-          <w:highlight w:val="white"/>
-        </w:rPr>
-        <w:t>Riflessione</w:t>
-      </w:r>
-      <w:r>
-        <w:rPr>
-          <w:rFonts w:ascii="Arial" w:eastAsia="Arial" w:hAnsi="Arial" w:cs="Arial"/>
-          <w:b/>
-          <w:bCs/>
-          <w:color w:val="000000"/>
-        </w:rPr>
-        <w:t xml:space="preserve"> del Celebrante </w:t>
-      </w:r>
-    </w:p>
-    <w:p>
-      <w:pPr>
-        <w:spacing w:after="0" w:line="240" w:lineRule="auto"/>
-        <w:rPr>
-          <w:rFonts w:ascii="Arial" w:eastAsia="Arial" w:hAnsi="Arial" w:cs="Arial"/>
-        </w:rPr>
-      </w:pPr>
-    </w:p>
-    <w:p>
-      <w:pPr>
-        <w:shd w:val="clear" w:color="auto" w:fill="FFFFFF"/>
-        <w:spacing w:after="0" w:line="240" w:lineRule="auto"/>
-        <w:rPr>
-          <w:rFonts w:ascii="Arial" w:eastAsia="Arial" w:hAnsi="Arial" w:cs="Arial"/>
-          <w:b/>
-          <w:bCs/>
-          <w:color w:val="0A0A0A"/>
-        </w:rPr>
-      </w:pPr>
-      <w:r>
-        <w:rPr>
-          <w:rFonts w:ascii="Arial" w:eastAsia="Arial" w:hAnsi="Arial" w:cs="Arial"/>
-          <w:b/>
-          <w:bCs/>
-          <w:color w:val="0A0A0A"/>
-        </w:rPr>
-        <w:t xml:space="preserve">Preghiere dei fedeli </w:t>
-      </w:r>
-    </w:p>
-    <w:p>
-      <w:pPr>
-        <w:shd w:val="clear" w:color="auto" w:fill="FFFFFF"/>
-        <w:spacing w:after="0" w:line="240" w:lineRule="auto"/>
-        <w:rPr>
-          <w:rFonts w:ascii="Arial" w:eastAsia="Arial" w:hAnsi="Arial" w:cs="Arial"/>
-          <w:b/>
-          <w:bCs/>
-          <w:color w:val="0A0A0A"/>
-        </w:rPr>
-      </w:pPr>
-    </w:p>
-    <w:p>
-      <w:pPr>
-        <w:shd w:val="clear" w:color="auto" w:fill="FFFFFF"/>
-        <w:spacing w:after="0" w:line="240" w:lineRule="auto"/>
-        <w:rPr>
-          <w:rFonts w:ascii="Arial" w:eastAsia="Arial" w:hAnsi="Arial" w:cs="Arial"/>
-          <w:b/>
-          <w:bCs/>
-          <w:color w:val="0A0A0A"/>
-        </w:rPr>
-      </w:pPr>
-      <w:r>
-        <w:rPr>
-          <w:rFonts w:ascii="Arial" w:eastAsia="Arial" w:hAnsi="Arial" w:cs="Arial"/>
-          <w:b/>
-          <w:bCs/>
-          <w:color w:val="0A0A0A"/>
-        </w:rPr>
-        <w:t>C:</w:t>
-      </w:r>
-      <w:r>
-        <w:rPr>
-          <w:rFonts w:ascii="Arial" w:eastAsia="Arial" w:hAnsi="Arial" w:cs="Arial"/>
-          <w:color w:val="0A0A0A"/>
-        </w:rPr>
-        <w:t xml:space="preserve"> Portiamo al Signore la nostra sete e le nostre ricerche e diciamo insieme: </w:t>
-      </w:r>
-      <w:r>
-        <w:rPr>
-          <w:rFonts w:ascii="Arial" w:eastAsia="Arial" w:hAnsi="Arial" w:cs="Arial"/>
-          <w:b/>
-          <w:bCs/>
-          <w:color w:val="0A0A0A"/>
-        </w:rPr>
-        <w:t>Signore, dacci dell'acqua viva.</w:t>
-      </w:r>
-    </w:p>
-    <w:p>
-      <w:pPr>
-        <w:shd w:val="clear" w:color="auto" w:fill="FFFFFF"/>
-        <w:spacing w:after="0" w:line="240" w:lineRule="auto"/>
-        <w:rPr>
-          <w:rFonts w:ascii="Arial" w:eastAsia="Arial" w:hAnsi="Arial" w:cs="Arial"/>
-          <w:b/>
-          <w:bCs/>
-          <w:color w:val="0A0A0A"/>
-        </w:rPr>
-      </w:pPr>
-    </w:p>
-    <w:p>
-      <w:pPr>
-        <w:pStyle w:val="Paragrafoelenco"/>
-        <w:numPr>
-          <w:ilvl w:val="0"/>
-          <w:numId w:val="3"/>
-        </w:numPr>
-        <w:shd w:val="clear" w:color="auto" w:fill="FFFFFF"/>
-        <w:spacing w:after="0" w:line="240" w:lineRule="auto"/>
-        <w:rPr>
-          <w:color w:val="0A0A0A"/>
-        </w:rPr>
-      </w:pPr>
-      <w:r>
-        <w:rPr>
-          <w:rFonts w:ascii="Arial" w:eastAsia="Arial" w:hAnsi="Arial" w:cs="Arial"/>
-          <w:color w:val="0A0A0A"/>
-        </w:rPr>
-        <w:t>Per quando cerchiamo la felicità nelle cose che passano e ci dimentichiamo di Te, preghiamo. </w:t>
-      </w:r>
-    </w:p>
-    <w:p>
-      <w:pPr>
-        <w:pStyle w:val="Paragrafoelenco"/>
-        <w:numPr>
-          <w:ilvl w:val="0"/>
-          <w:numId w:val="3"/>
-        </w:numPr>
-        <w:shd w:val="clear" w:color="auto" w:fill="FFFFFF"/>
-        <w:spacing w:after="0" w:line="240" w:lineRule="auto"/>
-        <w:rPr>
-          <w:color w:val="0A0A0A"/>
-        </w:rPr>
-      </w:pPr>
-      <w:r>
-        <w:rPr>
-          <w:rFonts w:ascii="Arial" w:eastAsia="Arial" w:hAnsi="Arial" w:cs="Arial"/>
-          <w:color w:val="0A0A0A"/>
-        </w:rPr>
-        <w:t>Per chi si sente "arido" e svuotato, perché trovi in questo campo una sorgente di amicizia, preghiamo.</w:t>
-      </w:r>
-    </w:p>
-    <w:p>
-      <w:pPr>
-        <w:pStyle w:val="Paragrafoelenco"/>
-        <w:numPr>
-          <w:ilvl w:val="0"/>
-          <w:numId w:val="3"/>
-        </w:numPr>
-        <w:shd w:val="clear" w:color="auto" w:fill="FFFFFF"/>
-        <w:spacing w:after="0" w:line="240" w:lineRule="auto"/>
-        <w:rPr>
-          <w:color w:val="0A0A0A"/>
-        </w:rPr>
-      </w:pPr>
-      <w:r>
-        <w:rPr>
-          <w:rFonts w:ascii="Arial" w:eastAsia="Arial" w:hAnsi="Arial" w:cs="Arial"/>
-          <w:color w:val="0A0A0A"/>
-        </w:rPr>
-        <w:t>Perché sappiamo cercare il bene in ogni compagno, anche in chi ci è meno simpatico, preghiamo. </w:t>
-      </w:r>
-    </w:p>
-    <w:p>
-      <w:pPr>
-        <w:pStyle w:val="Paragrafoelenco"/>
-        <w:numPr>
-          <w:ilvl w:val="0"/>
-          <w:numId w:val="3"/>
-        </w:numPr>
-        <w:shd w:val="clear" w:color="auto" w:fill="FFFFFF"/>
-        <w:spacing w:after="0" w:line="240" w:lineRule="auto"/>
-        <w:rPr>
-          <w:color w:val="0A0A0A"/>
-        </w:rPr>
-      </w:pPr>
-      <w:r>
-        <w:rPr>
-          <w:rFonts w:ascii="Arial" w:eastAsia="Arial" w:hAnsi="Arial" w:cs="Arial"/>
-          <w:color w:val="0A0A0A"/>
-        </w:rPr>
-        <w:t>Per la nostra ricerca di futuro e di sogni: guidaci Tu sulla strada giusta, preghiamo. </w:t>
-      </w:r>
-    </w:p>
-    <w:p>
-      <w:pPr>
-        <w:pStyle w:val="Paragrafoelenco"/>
-        <w:numPr>
-          <w:ilvl w:val="0"/>
-          <w:numId w:val="3"/>
-        </w:numPr>
-        <w:shd w:val="clear" w:color="auto" w:fill="FFFFFF"/>
-        <w:spacing w:after="0" w:line="240" w:lineRule="auto"/>
-        <w:rPr>
-          <w:color w:val="0A0A0A"/>
-        </w:rPr>
-      </w:pPr>
-      <w:r>
-        <w:rPr>
-          <w:rFonts w:ascii="Arial" w:eastAsia="Arial" w:hAnsi="Arial" w:cs="Arial"/>
-          <w:color w:val="0A0A0A"/>
-        </w:rPr>
-        <w:t>Per questo camposcuola e per chi</w:t>
-      </w:r>
-      <w:r>
-        <w:rPr>
-          <w:rFonts w:ascii="Arial" w:eastAsia="Arial" w:hAnsi="Arial" w:cs="Arial"/>
-          <w:color w:val="0A0A0A"/>
-        </w:rPr>
-        <w:t xml:space="preserve"> ci attende a casa, affinché il bene che vivremo in queste giornate sia condiviso con tutti quelli che incontreremo sulla nostra strada. Preghiamo.</w:t>
-      </w:r>
-    </w:p>
-    <w:p>
-      <w:pPr>
-        <w:shd w:val="clear" w:color="auto" w:fill="FFFFFF"/>
-        <w:tabs>
-          <w:tab w:val="left" w:pos="8505"/>
-        </w:tabs>
-        <w:spacing w:after="0" w:line="240" w:lineRule="auto"/>
-        <w:rPr>
-          <w:rFonts w:ascii="Arial" w:eastAsia="Arial" w:hAnsi="Arial" w:cs="Arial"/>
-          <w:color w:val="0A0A0A"/>
-        </w:rPr>
-      </w:pPr>
-      <w:r>
-        <w:rPr>
-          <w:rFonts w:ascii="Arial" w:eastAsia="Arial" w:hAnsi="Arial" w:cs="Arial"/>
-          <w:color w:val="0A0A0A"/>
-        </w:rPr>
-        <w:tab/>
-      </w:r>
-    </w:p>
-    <w:p>
-      <w:pPr>
-        <w:shd w:val="clear" w:color="auto" w:fill="FFFFFF"/>
-        <w:tabs>
-          <w:tab w:val="left" w:pos="8505"/>
-        </w:tabs>
-        <w:spacing w:after="0" w:line="240" w:lineRule="auto"/>
-        <w:rPr>
-          <w:rFonts w:ascii="Arial" w:eastAsia="Arial" w:hAnsi="Arial" w:cs="Arial"/>
-          <w:b/>
-          <w:bCs/>
-          <w:color w:val="0A0A0A"/>
-        </w:rPr>
-      </w:pPr>
-      <w:r>
-        <w:rPr>
-          <w:rFonts w:ascii="Arial" w:eastAsia="Arial" w:hAnsi="Arial" w:cs="Arial"/>
-          <w:b/>
-          <w:bCs/>
-          <w:color w:val="0A0A0A"/>
-        </w:rPr>
-        <w:t xml:space="preserve">Segno </w:t>
-      </w:r>
-    </w:p>
-    <w:p>
-      <w:pPr>
-        <w:shd w:val="clear" w:color="auto" w:fill="FFFFFF"/>
-        <w:tabs>
-          <w:tab w:val="left" w:pos="8505"/>
-        </w:tabs>
-        <w:spacing w:after="0" w:line="240" w:lineRule="auto"/>
-        <w:rPr>
-          <w:rFonts w:ascii="Arial" w:eastAsia="Arial" w:hAnsi="Arial" w:cs="Arial"/>
-          <w:b/>
-          <w:bCs/>
-          <w:color w:val="0A0A0A"/>
-        </w:rPr>
-      </w:pPr>
-      <w:r>
-        <w:rPr>
-          <w:rFonts w:ascii="Arial" w:eastAsia="Arial" w:hAnsi="Arial" w:cs="Arial"/>
-          <w:b/>
-          <w:bCs/>
-          <w:color w:val="0A0A0A"/>
-        </w:rPr>
-        <w:t xml:space="preserve">Ancora su cartellone – ciascun ragazzo scrive una persona che è la propria ancora nella fede o nella vita </w:t>
-      </w:r>
-    </w:p>
-    <w:p>
-      <w:pPr>
-        <w:shd w:val="clear" w:color="auto" w:fill="FFFFFF"/>
-        <w:spacing w:after="0" w:line="240" w:lineRule="auto"/>
-        <w:rPr>
-          <w:rFonts w:ascii="Arial" w:eastAsia="Arial" w:hAnsi="Arial" w:cs="Arial"/>
-          <w:b/>
-          <w:bCs/>
-          <w:color w:val="0A0A0A"/>
-        </w:rPr>
-      </w:pPr>
-    </w:p>
-    <w:p>
-      <w:pPr>
-        <w:shd w:val="clear" w:color="auto" w:fill="FFFFFF"/>
-        <w:spacing w:after="0" w:line="240" w:lineRule="auto"/>
-        <w:rPr>
-          <w:rFonts w:ascii="Arial" w:eastAsia="Arial" w:hAnsi="Arial" w:cs="Arial"/>
-          <w:b/>
-          <w:bCs/>
-          <w:color w:val="0A0A0A"/>
-        </w:rPr>
-      </w:pPr>
-      <w:r>
-        <w:rPr>
-          <w:rFonts w:ascii="Arial" w:eastAsia="Arial" w:hAnsi="Arial" w:cs="Arial"/>
-          <w:b/>
-          <w:bCs/>
-          <w:color w:val="0A0A0A"/>
-        </w:rPr>
-        <w:t>Padre Nostro</w:t>
-      </w:r>
-    </w:p>
-    <w:p>
-      <w:pPr>
-        <w:shd w:val="clear" w:color="auto" w:fill="FFFFFF"/>
-        <w:spacing w:after="0" w:line="240" w:lineRule="auto"/>
-        <w:rPr>
-          <w:rFonts w:ascii="Arial" w:eastAsia="Arial" w:hAnsi="Arial" w:cs="Arial"/>
-          <w:b/>
-          <w:bCs/>
-          <w:color w:val="0A0A0A"/>
-        </w:rPr>
-      </w:pPr>
-    </w:p>
-    <w:p>
-      <w:pPr>
-        <w:shd w:val="clear" w:color="auto" w:fill="FFFFFF"/>
-        <w:spacing w:after="0" w:line="240" w:lineRule="auto"/>
-        <w:rPr>
-          <w:rFonts w:ascii="Arial" w:eastAsia="Arial" w:hAnsi="Arial" w:cs="Arial"/>
-          <w:color w:val="0A0A0A"/>
-        </w:rPr>
-      </w:pPr>
-      <w:r>
-        <w:rPr>
-          <w:rFonts w:ascii="Arial" w:eastAsia="Arial" w:hAnsi="Arial" w:cs="Arial"/>
-          <w:b/>
-          <w:bCs/>
-          <w:color w:val="0A0A0A"/>
-        </w:rPr>
-        <w:t>C:</w:t>
-      </w:r>
-      <w:r>
-        <w:rPr>
-          <w:rFonts w:ascii="Arial" w:eastAsia="Arial" w:hAnsi="Arial" w:cs="Arial"/>
-          <w:color w:val="0A0A0A"/>
-        </w:rPr>
-        <w:t> Il Signore sia il vostro pozzo di acqua fresca nei momenti di stanchezza. Vi doni occhi capaci di cercarlo e cuore capace di riconoscerlo.</w:t>
-      </w:r>
-      <w:r>
-        <w:rPr>
-          <w:rFonts w:ascii="Arial" w:eastAsia="Arial" w:hAnsi="Arial" w:cs="Arial"/>
-          <w:color w:val="0A0A0A"/>
-        </w:rPr>
-        <w:br/>
-      </w:r>
-      <w:r>
-        <w:rPr>
-          <w:rFonts w:ascii="Arial" w:eastAsia="Arial" w:hAnsi="Arial" w:cs="Arial"/>
-          <w:b/>
-          <w:bCs/>
-          <w:color w:val="0A0A0A"/>
-        </w:rPr>
-        <w:t>T:</w:t>
-      </w:r>
-      <w:r>
-        <w:rPr>
-          <w:rFonts w:ascii="Arial" w:eastAsia="Arial" w:hAnsi="Arial" w:cs="Arial"/>
-          <w:color w:val="0A0A0A"/>
-        </w:rPr>
-        <w:t> Amen.</w:t>
-      </w:r>
-      <w:r>
-        <w:rPr>
-          <w:rFonts w:ascii="Arial" w:eastAsia="Arial" w:hAnsi="Arial" w:cs="Arial"/>
-          <w:color w:val="0A0A0A"/>
-        </w:rPr>
-        <w:br/>
-      </w:r>
-      <w:r>
-        <w:rPr>
-          <w:rFonts w:ascii="Arial" w:eastAsia="Arial" w:hAnsi="Arial" w:cs="Arial"/>
-          <w:b/>
-          <w:bCs/>
-          <w:color w:val="0A0A0A"/>
-        </w:rPr>
-        <w:t>C:</w:t>
-      </w:r>
-      <w:r>
-        <w:rPr>
-          <w:rFonts w:ascii="Arial" w:eastAsia="Arial" w:hAnsi="Arial" w:cs="Arial"/>
-          <w:color w:val="0A0A0A"/>
-        </w:rPr>
-        <w:t> E la benedizione di Dio onnipotente, Padre e Figlio e Spirito Santo, discenda su di voi e con voi rimanga sempre.</w:t>
-      </w:r>
-      <w:r>
-        <w:rPr>
-          <w:rFonts w:ascii="Arial" w:eastAsia="Arial" w:hAnsi="Arial" w:cs="Arial"/>
-          <w:color w:val="0A0A0A"/>
-        </w:rPr>
-        <w:br/>
-      </w:r>
-      <w:r>
-        <w:rPr>
-          <w:rFonts w:ascii="Arial" w:eastAsia="Arial" w:hAnsi="Arial" w:cs="Arial"/>
-          <w:b/>
-          <w:bCs/>
-          <w:color w:val="0A0A0A"/>
-        </w:rPr>
-        <w:t>T:</w:t>
-      </w:r>
-      <w:r>
-        <w:rPr>
-          <w:rFonts w:ascii="Arial" w:eastAsia="Arial" w:hAnsi="Arial" w:cs="Arial"/>
-          <w:color w:val="0A0A0A"/>
-        </w:rPr>
-        <w:t> Amen.</w:t>
-      </w:r>
-    </w:p>
-    <w:p>
-      <w:pPr>
-        <w:shd w:val="clear" w:color="auto" w:fill="FFFFFF"/>
-        <w:spacing w:after="0" w:line="240" w:lineRule="auto"/>
-        <w:rPr>
-          <w:rFonts w:ascii="Arial" w:eastAsia="Arial" w:hAnsi="Arial" w:cs="Arial"/>
-          <w:color w:val="0A0A0A"/>
-        </w:rPr>
-      </w:pPr>
-    </w:p>
-    <w:p>
-      <w:pPr>
-        <w:shd w:val="clear" w:color="auto" w:fill="FFFFFF"/>
-        <w:spacing w:after="0" w:line="240" w:lineRule="auto"/>
-        <w:rPr>
-          <w:rFonts w:ascii="Arial" w:eastAsia="Arial" w:hAnsi="Arial" w:cs="Arial"/>
-          <w:b/>
-          <w:bCs/>
-          <w:color w:val="0A0A0A"/>
-        </w:rPr>
-      </w:pPr>
-      <w:r>
-        <w:rPr>
-          <w:rFonts w:ascii="Arial" w:eastAsia="Arial" w:hAnsi="Arial" w:cs="Arial"/>
-          <w:b/>
-          <w:bCs/>
-          <w:color w:val="0A0A0A"/>
-        </w:rPr>
-        <w:t>Canto finale</w:t>
-      </w:r>
-      <w:r>
-        <w:rPr>
-          <w:rFonts w:ascii="Arial" w:eastAsia="Arial" w:hAnsi="Arial" w:cs="Arial"/>
-          <w:b/>
-          <w:bCs/>
-          <w:color w:val="0A0A0A"/>
-        </w:rPr>
-        <w:t xml:space="preserve"> </w:t>
-      </w:r>
-      <w:r>
-        <w:rPr>
-          <w:rFonts w:ascii="Arial" w:eastAsia="Arial" w:hAnsi="Arial" w:cs="Arial"/>
-          <w:b/>
-          <w:bCs/>
-          <w:color w:val="0A0A0A"/>
-        </w:rPr>
-        <w:br w:type="page"/>
-      </w:r>
-    </w:p>
-    <w:p>
-      <w:pPr>
-        <w:shd w:val="clear" w:color="auto" w:fill="FFFFFF"/>
-        <w:spacing w:after="0" w:line="240" w:lineRule="auto"/>
-        <w:rPr>
-          <w:rFonts w:ascii="Arial" w:eastAsia="Arial" w:hAnsi="Arial" w:cs="Arial"/>
-          <w:b/>
-          <w:bCs/>
-          <w:color w:val="0A0A0A"/>
-        </w:rPr>
-      </w:pPr>
-      <w:r>
-        <w:rPr>
-          <w:rFonts w:ascii="Arial" w:eastAsia="Arial" w:hAnsi="Arial" w:cs="Arial"/>
-          <w:b/>
-          <w:bCs/>
-          <w:color w:val="0A0A0A"/>
-        </w:rPr>
-        <w:lastRenderedPageBreak/>
-        <w:t xml:space="preserve">19 Agosto </w:t>
-      </w:r>
-      <w:r>
-        <w:rPr>
-          <w:rFonts w:ascii="Arial" w:eastAsia="Arial" w:hAnsi="Arial" w:cs="Arial"/>
-          <w:b/>
-          <w:bCs/>
-          <w:color w:val="0A0A0A"/>
-        </w:rPr>
-        <w:t>Mattino</w:t>
-      </w:r>
-      <w:r>
-        <w:rPr>
-          <w:rFonts w:ascii="Arial" w:eastAsia="Arial" w:hAnsi="Arial" w:cs="Arial"/>
-          <w:b/>
-          <w:bCs/>
-          <w:color w:val="0A0A0A"/>
-        </w:rPr>
-        <w:t xml:space="preserve"> </w:t>
-      </w:r>
-    </w:p>
-    <w:p>
-      <w:pPr>
-        <w:shd w:val="clear" w:color="auto" w:fill="FFFFFF"/>
-        <w:spacing w:after="0" w:line="240" w:lineRule="auto"/>
-        <w:rPr>
-          <w:rFonts w:ascii="Arial" w:eastAsia="Arial" w:hAnsi="Arial" w:cs="Arial"/>
-          <w:b/>
-          <w:bCs/>
-          <w:color w:val="0A0A0A"/>
-          <w:highlight w:val="white"/>
-        </w:rPr>
-      </w:pPr>
-    </w:p>
-    <w:p>
-      <w:pPr>
-        <w:shd w:val="clear" w:color="auto" w:fill="FFFFFF"/>
-        <w:spacing w:after="0" w:line="240" w:lineRule="auto"/>
-        <w:rPr>
-          <w:rFonts w:ascii="Arial" w:eastAsia="Arial" w:hAnsi="Arial" w:cs="Arial"/>
-          <w:b/>
-          <w:bCs/>
-          <w:color w:val="0A0A0A"/>
-          <w:highlight w:val="white"/>
-        </w:rPr>
-      </w:pPr>
-      <w:r>
-        <w:rPr>
-          <w:rFonts w:ascii="Arial" w:eastAsia="Arial" w:hAnsi="Arial" w:cs="Arial"/>
-          <w:b/>
-          <w:bCs/>
-          <w:color w:val="0A0A0A"/>
-          <w:highlight w:val="white"/>
-        </w:rPr>
-        <w:t xml:space="preserve">Canto inziale </w:t>
-      </w:r>
-    </w:p>
-    <w:p>
-      <w:pPr>
-        <w:shd w:val="clear" w:color="auto" w:fill="FFFFFF"/>
-        <w:spacing w:after="0" w:line="240" w:lineRule="auto"/>
-        <w:rPr>
-          <w:rFonts w:ascii="Arial" w:eastAsia="Arial" w:hAnsi="Arial" w:cs="Arial"/>
-          <w:b/>
-          <w:bCs/>
-          <w:color w:val="0A0A0A"/>
-          <w:highlight w:val="white"/>
-        </w:rPr>
-      </w:pPr>
-    </w:p>
-    <w:p>
-      <w:pPr>
-        <w:shd w:val="clear" w:color="auto" w:fill="FFFFFF"/>
-        <w:spacing w:after="0" w:line="240" w:lineRule="auto"/>
-        <w:rPr>
-          <w:rFonts w:ascii="Arial" w:eastAsia="Arial" w:hAnsi="Arial" w:cs="Arial"/>
-          <w:color w:val="0A0A0A"/>
-          <w:highlight w:val="white"/>
-        </w:rPr>
-      </w:pPr>
-      <w:r>
-        <w:rPr>
-          <w:rFonts w:ascii="Arial" w:eastAsia="Arial" w:hAnsi="Arial" w:cs="Arial"/>
-          <w:b/>
-          <w:bCs/>
-          <w:color w:val="0A0A0A"/>
-          <w:highlight w:val="white"/>
-        </w:rPr>
-        <w:t>C:</w:t>
-      </w:r>
-      <w:r>
-        <w:rPr>
-          <w:rFonts w:ascii="Arial" w:eastAsia="Arial" w:hAnsi="Arial" w:cs="Arial"/>
-          <w:color w:val="0A0A0A"/>
-          <w:highlight w:val="white"/>
-        </w:rPr>
-        <w:t> Nel nome del Padre, del Figlio e dello Spirito Santo.</w:t>
-      </w:r>
-      <w:r>
-        <w:rPr>
-          <w:rFonts w:ascii="Arial" w:eastAsia="Arial" w:hAnsi="Arial" w:cs="Arial"/>
-          <w:color w:val="0A0A0A"/>
-        </w:rPr>
-        <w:br/>
-      </w:r>
-      <w:r>
-        <w:rPr>
-          <w:rFonts w:ascii="Arial" w:eastAsia="Arial" w:hAnsi="Arial" w:cs="Arial"/>
-          <w:b/>
-          <w:bCs/>
-          <w:color w:val="0A0A0A"/>
-          <w:highlight w:val="white"/>
-        </w:rPr>
-        <w:t>T:</w:t>
-      </w:r>
-      <w:r>
-        <w:rPr>
-          <w:rFonts w:ascii="Arial" w:eastAsia="Arial" w:hAnsi="Arial" w:cs="Arial"/>
-          <w:color w:val="0A0A0A"/>
-          <w:highlight w:val="white"/>
-        </w:rPr>
-        <w:t> Amen.</w:t>
-      </w:r>
-      <w:r>
-        <w:rPr>
-          <w:rFonts w:ascii="Arial" w:eastAsia="Arial" w:hAnsi="Arial" w:cs="Arial"/>
-          <w:color w:val="0A0A0A"/>
-        </w:rPr>
-        <w:br/>
-      </w:r>
-      <w:r>
-        <w:rPr>
-          <w:rFonts w:ascii="Arial" w:eastAsia="Arial" w:hAnsi="Arial" w:cs="Arial"/>
-          <w:b/>
-          <w:bCs/>
-          <w:color w:val="0A0A0A"/>
-          <w:highlight w:val="white"/>
-        </w:rPr>
-        <w:t>C:</w:t>
-      </w:r>
-      <w:r>
-        <w:rPr>
-          <w:rFonts w:ascii="Arial" w:eastAsia="Arial" w:hAnsi="Arial" w:cs="Arial"/>
-          <w:color w:val="0A0A0A"/>
-          <w:highlight w:val="white"/>
-        </w:rPr>
-        <w:t> Il Signore, che ci parla nel silenzio dell’aurora e nel rumore dei nostri passi, sia con tutti voi.</w:t>
-      </w:r>
-    </w:p>
-    <w:p>
-      <w:pPr>
-        <w:shd w:val="clear" w:color="auto" w:fill="FFFFFF"/>
-        <w:spacing w:after="0" w:line="240" w:lineRule="auto"/>
-        <w:rPr>
-          <w:rFonts w:ascii="Arial" w:eastAsia="Arial" w:hAnsi="Arial" w:cs="Arial"/>
-          <w:color w:val="0A0A0A"/>
-          <w:highlight w:val="white"/>
-        </w:rPr>
-      </w:pPr>
-      <w:r>
-        <w:rPr>
-          <w:rFonts w:ascii="Arial" w:eastAsia="Arial" w:hAnsi="Arial" w:cs="Arial"/>
-          <w:b/>
-          <w:bCs/>
-          <w:color w:val="0A0A0A"/>
-          <w:highlight w:val="white"/>
-        </w:rPr>
-        <w:t>T</w:t>
-      </w:r>
-      <w:r>
-        <w:rPr>
-          <w:rFonts w:ascii="Arial" w:eastAsia="Arial" w:hAnsi="Arial" w:cs="Arial"/>
-          <w:color w:val="0A0A0A"/>
-          <w:highlight w:val="white"/>
-        </w:rPr>
-        <w:t>: E con il tuo spirito</w:t>
-      </w:r>
-      <w:r>
-        <w:rPr>
-          <w:rFonts w:ascii="Arial" w:eastAsia="Arial" w:hAnsi="Arial" w:cs="Arial"/>
-          <w:color w:val="0A0A0A"/>
-        </w:rPr>
-        <w:br/>
-      </w:r>
-      <w:r>
-        <w:rPr>
-          <w:rFonts w:ascii="Arial" w:eastAsia="Arial" w:hAnsi="Arial" w:cs="Arial"/>
-          <w:b/>
-          <w:bCs/>
-          <w:color w:val="0A0A0A"/>
-          <w:highlight w:val="white"/>
-        </w:rPr>
-        <w:t>C:</w:t>
-      </w:r>
-      <w:r>
-        <w:rPr>
-          <w:rFonts w:ascii="Arial" w:eastAsia="Arial" w:hAnsi="Arial" w:cs="Arial"/>
-          <w:color w:val="0A0A0A"/>
-          <w:highlight w:val="white"/>
-        </w:rPr>
-        <w:t> Buongiorno! Spesso pensiamo che ascoltare significhi solo 'sentire' dei suoni. Ma l'ascolto vero è un'arte: è fare spazio a qualcuno dentro di noi. Oggi il campo ci sfida a questo: ascoltare il compagno di stanza, ascoltare il bosco, ascoltare la voce di Dio che ci sussurra che siamo amati. Iniziamo la giornata chiedendo il dono di un ascolto attento.</w:t>
-      </w:r>
-    </w:p>
-    <w:p>
-      <w:pPr>
-        <w:shd w:val="clear" w:color="auto" w:fill="FFFFFF"/>
-        <w:spacing w:after="0" w:line="240" w:lineRule="auto"/>
-        <w:rPr>
-          <w:rFonts w:ascii="Arial" w:eastAsia="Arial" w:hAnsi="Arial" w:cs="Arial"/>
-          <w:color w:val="0A0A0A"/>
-          <w:highlight w:val="white"/>
-        </w:rPr>
-      </w:pPr>
-    </w:p>
-    <w:p>
-      <w:pPr>
-        <w:spacing w:after="0" w:line="240" w:lineRule="auto"/>
-        <w:rPr>
-          <w:rFonts w:ascii="Arial" w:eastAsia="Arial" w:hAnsi="Arial" w:cs="Arial"/>
-          <w:b/>
-          <w:bCs/>
-          <w:color w:val="0A0A0A"/>
-          <w:highlight w:val="white"/>
-        </w:rPr>
-      </w:pPr>
-      <w:r>
-        <w:rPr>
-          <w:rFonts w:ascii="Arial" w:eastAsia="Arial" w:hAnsi="Arial" w:cs="Arial"/>
-          <w:b/>
-          <w:bCs/>
-          <w:color w:val="0A0A0A"/>
-          <w:highlight w:val="white"/>
-        </w:rPr>
-        <w:t>Salmo 41</w:t>
-      </w:r>
-    </w:p>
-    <w:p>
-      <w:pPr>
-        <w:shd w:val="clear" w:color="auto" w:fill="FFFFFF"/>
-        <w:spacing w:after="0" w:line="240" w:lineRule="auto"/>
-        <w:rPr>
-          <w:rFonts w:ascii="Arial" w:eastAsia="Arial" w:hAnsi="Arial" w:cs="Arial"/>
-        </w:rPr>
-      </w:pPr>
-    </w:p>
-    <w:p>
-      <w:pPr>
-        <w:shd w:val="clear" w:color="auto" w:fill="FFFFFF"/>
-        <w:spacing w:after="0" w:line="240" w:lineRule="auto"/>
-        <w:rPr>
-          <w:rFonts w:ascii="Arial" w:eastAsia="Arial" w:hAnsi="Arial" w:cs="Arial"/>
-        </w:rPr>
-      </w:pPr>
-      <w:r>
-        <w:rPr>
-          <w:rFonts w:ascii="Arial" w:eastAsia="Arial" w:hAnsi="Arial" w:cs="Arial"/>
-        </w:rPr>
-        <w:t>Preservami, o Dio, perché io confido in te.</w:t>
-      </w:r>
-      <w:r>
-        <w:rPr>
-          <w:rFonts w:ascii="Arial" w:eastAsia="Arial" w:hAnsi="Arial" w:cs="Arial"/>
-        </w:rPr>
-        <w:br/>
-        <w:t>Io ho detto all'Eterno: “Tu sei il mio Signore;</w:t>
-      </w:r>
-      <w:r>
-        <w:rPr>
-          <w:rFonts w:ascii="Arial" w:eastAsia="Arial" w:hAnsi="Arial" w:cs="Arial"/>
-        </w:rPr>
-        <w:br/>
-        <w:t>io non ho altro bene all'infuori di te”;</w:t>
-      </w:r>
-      <w:r>
-        <w:rPr>
-          <w:rFonts w:ascii="Arial" w:eastAsia="Arial" w:hAnsi="Arial" w:cs="Arial"/>
-        </w:rPr>
-        <w:br/>
-      </w:r>
-    </w:p>
-    <w:p>
-      <w:pPr>
-        <w:shd w:val="clear" w:color="auto" w:fill="FFFFFF"/>
-        <w:spacing w:after="0" w:line="240" w:lineRule="auto"/>
-        <w:rPr>
-          <w:rFonts w:ascii="Arial" w:eastAsia="Arial" w:hAnsi="Arial" w:cs="Arial"/>
-        </w:rPr>
-      </w:pPr>
-      <w:r>
-        <w:rPr>
-          <w:rFonts w:ascii="Arial" w:eastAsia="Arial" w:hAnsi="Arial" w:cs="Arial"/>
-        </w:rPr>
-        <w:t>e quanto ai santi che sono in terra</w:t>
-      </w:r>
-      <w:r>
-        <w:rPr>
-          <w:rFonts w:ascii="Arial" w:eastAsia="Arial" w:hAnsi="Arial" w:cs="Arial"/>
-        </w:rPr>
-        <w:br/>
-        <w:t>essi sono la gente onorata in cui ripongo tutto il mio affetto.</w:t>
-      </w:r>
-      <w:r>
-        <w:rPr>
-          <w:rFonts w:ascii="Arial" w:eastAsia="Arial" w:hAnsi="Arial" w:cs="Arial"/>
-        </w:rPr>
-        <w:br/>
-        <w:t>I dolori di quelli che corrono dietro ad altri dèi</w:t>
-      </w:r>
-      <w:r>
-        <w:rPr>
-          <w:rFonts w:ascii="Arial" w:eastAsia="Arial" w:hAnsi="Arial" w:cs="Arial"/>
-        </w:rPr>
-        <w:br/>
-        <w:t>saranno moltiplicati;</w:t>
-      </w:r>
-      <w:r>
-        <w:rPr>
-          <w:rFonts w:ascii="Arial" w:eastAsia="Arial" w:hAnsi="Arial" w:cs="Arial"/>
-        </w:rPr>
-        <w:br/>
-        <w:t>io non offrirò le loro libazioni di sangue,</w:t>
-      </w:r>
-      <w:r>
-        <w:rPr>
-          <w:rFonts w:ascii="Arial" w:eastAsia="Arial" w:hAnsi="Arial" w:cs="Arial"/>
-        </w:rPr>
-        <w:br/>
-        <w:t>né le mie labbra proferiranno i loro nomi.</w:t>
-      </w:r>
-      <w:r>
-        <w:rPr>
-          <w:rFonts w:ascii="Arial" w:eastAsia="Arial" w:hAnsi="Arial" w:cs="Arial"/>
-        </w:rPr>
-        <w:br/>
-      </w:r>
-    </w:p>
-    <w:p>
-      <w:pPr>
-        <w:shd w:val="clear" w:color="auto" w:fill="FFFFFF"/>
-        <w:spacing w:after="0" w:line="240" w:lineRule="auto"/>
-        <w:rPr>
-          <w:rFonts w:ascii="Arial" w:eastAsia="Arial" w:hAnsi="Arial" w:cs="Arial"/>
-        </w:rPr>
-      </w:pPr>
-      <w:r>
-        <w:rPr>
-          <w:rFonts w:ascii="Arial" w:eastAsia="Arial" w:hAnsi="Arial" w:cs="Arial"/>
-        </w:rPr>
-        <w:t>L'Eterno è la mia parte di eredità e il mio calice;</w:t>
-      </w:r>
-      <w:r>
-        <w:rPr>
-          <w:rFonts w:ascii="Arial" w:eastAsia="Arial" w:hAnsi="Arial" w:cs="Arial"/>
-        </w:rPr>
-        <w:br/>
-        <w:t>tu mantieni quel che m'è toccato in sorte.</w:t>
-      </w:r>
-      <w:r>
-        <w:rPr>
-          <w:rFonts w:ascii="Arial" w:eastAsia="Arial" w:hAnsi="Arial" w:cs="Arial"/>
-        </w:rPr>
-        <w:br/>
-        <w:t>La sorte è caduta per me in luoghi dilettevoli;</w:t>
-      </w:r>
-      <w:r>
-        <w:rPr>
-          <w:rFonts w:ascii="Arial" w:eastAsia="Arial" w:hAnsi="Arial" w:cs="Arial"/>
-        </w:rPr>
-        <w:br/>
-        <w:t>una bella eredità mi è pur toccata!</w:t>
-      </w:r>
-      <w:r>
-        <w:rPr>
-          <w:rFonts w:ascii="Arial" w:eastAsia="Arial" w:hAnsi="Arial" w:cs="Arial"/>
-        </w:rPr>
-        <w:br/>
-      </w:r>
-    </w:p>
-    <w:p>
-      <w:pPr>
-        <w:shd w:val="clear" w:color="auto" w:fill="FFFFFF"/>
-        <w:spacing w:after="0" w:line="240" w:lineRule="auto"/>
-        <w:rPr>
-          <w:rFonts w:ascii="Arial" w:eastAsia="Arial" w:hAnsi="Arial" w:cs="Arial"/>
-        </w:rPr>
-      </w:pPr>
-      <w:r>
-        <w:rPr>
-          <w:rFonts w:ascii="Arial" w:eastAsia="Arial" w:hAnsi="Arial" w:cs="Arial"/>
-        </w:rPr>
-        <w:t>Io benedirò l'Eterno che mi consiglia;</w:t>
-      </w:r>
-      <w:r>
-        <w:rPr>
-          <w:rFonts w:ascii="Arial" w:eastAsia="Arial" w:hAnsi="Arial" w:cs="Arial"/>
-        </w:rPr>
-        <w:br/>
-        <w:t>anche la notte le mie reni mi ammaestrano.</w:t>
-      </w:r>
-      <w:r>
-        <w:rPr>
-          <w:rFonts w:ascii="Arial" w:eastAsia="Arial" w:hAnsi="Arial" w:cs="Arial"/>
-        </w:rPr>
-        <w:br/>
-        <w:t>Io ho sempre posto l'Eterno davanti agli occhi miei;</w:t>
-      </w:r>
-      <w:r>
-        <w:rPr>
-          <w:rFonts w:ascii="Arial" w:eastAsia="Arial" w:hAnsi="Arial" w:cs="Arial"/>
-        </w:rPr>
-        <w:br/>
-        <w:t>poiché egli è alla mia destra, io non sarò affatto smosso.</w:t>
-      </w:r>
-      <w:r>
-        <w:rPr>
-          <w:rFonts w:ascii="Arial" w:eastAsia="Arial" w:hAnsi="Arial" w:cs="Arial"/>
-        </w:rPr>
-        <w:br/>
-      </w:r>
-    </w:p>
-    <w:p>
-      <w:pPr>
-        <w:shd w:val="clear" w:color="auto" w:fill="FFFFFF"/>
-        <w:spacing w:after="0" w:line="240" w:lineRule="auto"/>
-        <w:rPr>
-          <w:rFonts w:ascii="Arial" w:eastAsia="Arial" w:hAnsi="Arial" w:cs="Arial"/>
-        </w:rPr>
-      </w:pPr>
-      <w:r>
-        <w:rPr>
-          <w:rFonts w:ascii="Arial" w:eastAsia="Arial" w:hAnsi="Arial" w:cs="Arial"/>
-        </w:rPr>
-        <w:t>Perciò il mio cuore si rallegra e l'anima mia festeggia;</w:t>
-      </w:r>
-      <w:r>
-        <w:rPr>
-          <w:rFonts w:ascii="Arial" w:eastAsia="Arial" w:hAnsi="Arial" w:cs="Arial"/>
-        </w:rPr>
-        <w:br/>
-        <w:t>anche la mia carne dimorerà al sicuro;</w:t>
-      </w:r>
-      <w:r>
-        <w:rPr>
-          <w:rFonts w:ascii="Arial" w:eastAsia="Arial" w:hAnsi="Arial" w:cs="Arial"/>
-        </w:rPr>
-        <w:br/>
-        <w:t>poiché tu non abbandonerai l'anima mia in potere della morte,</w:t>
-      </w:r>
-      <w:r>
-        <w:rPr>
-          <w:rFonts w:ascii="Arial" w:eastAsia="Arial" w:hAnsi="Arial" w:cs="Arial"/>
-        </w:rPr>
-        <w:br/>
-        <w:t>né permetterai che il tuo santo veda la fossa.</w:t>
-      </w:r>
-      <w:r>
-        <w:rPr>
-          <w:rFonts w:ascii="Arial" w:eastAsia="Arial" w:hAnsi="Arial" w:cs="Arial"/>
-        </w:rPr>
-        <w:br/>
-      </w:r>
-    </w:p>
-    <w:p>
-      <w:pPr>
-        <w:shd w:val="clear" w:color="auto" w:fill="FFFFFF"/>
-        <w:spacing w:after="0" w:line="240" w:lineRule="auto"/>
-        <w:rPr>
-          <w:rFonts w:ascii="Arial" w:eastAsia="Arial" w:hAnsi="Arial" w:cs="Arial"/>
-        </w:rPr>
-      </w:pPr>
-      <w:r>
-        <w:rPr>
-          <w:rFonts w:ascii="Arial" w:eastAsia="Arial" w:hAnsi="Arial" w:cs="Arial"/>
-        </w:rPr>
-        <w:t>Tu mi mostrerai il sentiero della vita;</w:t>
-      </w:r>
-      <w:r>
-        <w:rPr>
-          <w:rFonts w:ascii="Arial" w:eastAsia="Arial" w:hAnsi="Arial" w:cs="Arial"/>
-        </w:rPr>
-        <w:br/>
-        <w:t>vi sono gioie a sazietà alla tua presenza;</w:t>
-      </w:r>
-      <w:r>
-        <w:rPr>
-          <w:rFonts w:ascii="Arial" w:eastAsia="Arial" w:hAnsi="Arial" w:cs="Arial"/>
-        </w:rPr>
-        <w:br/>
-        <w:t>vi sono delizie alla tua destra in eterno.</w:t>
-      </w:r>
-    </w:p>
-    <w:p>
-      <w:pPr>
-        <w:spacing w:after="0" w:line="240" w:lineRule="auto"/>
-        <w:rPr>
-          <w:rFonts w:ascii="Arial" w:eastAsia="Arial" w:hAnsi="Arial" w:cs="Arial"/>
-          <w:b/>
-          <w:bCs/>
-          <w:color w:val="0A0A0A"/>
-          <w:highlight w:val="white"/>
-        </w:rPr>
-      </w:pPr>
-    </w:p>
-    <w:p>
-      <w:pPr>
-        <w:spacing w:after="0" w:line="240" w:lineRule="auto"/>
-        <w:rPr>
-          <w:rFonts w:ascii="Arial" w:eastAsia="Arial" w:hAnsi="Arial" w:cs="Arial"/>
-          <w:b/>
-          <w:bCs/>
-          <w:color w:val="0A0A0A"/>
-          <w:highlight w:val="white"/>
-        </w:rPr>
-        <w:sectPr>
-          <w:type w:val="continuous"/>
-          <w:pgSz w:w="11906" w:h="16838"/>
-          <w:pgMar w:top="1417" w:right="1134" w:bottom="1134" w:left="1134" w:header="708" w:footer="708" w:gutter="0"/>
-          <w:cols w:space="720"/>
-        </w:sectPr>
-      </w:pPr>
-      <w:r>
-        <w:rPr>
-          <w:rFonts w:ascii="Arial" w:eastAsia="Arial" w:hAnsi="Arial" w:cs="Arial"/>
           <w:b/>
           <w:bCs/>
           <w:color w:val="0A0A0A"/>
@@ -2543,6 +2673,7 @@
           <w:color w:val="0A0A0A"/>
         </w:rPr>
       </w:pPr>
+      <w:bookmarkStart w:id="10" w:name="_Hlk230687635"/>
       <w:r>
         <w:rPr>
           <w:rFonts w:ascii="Arial" w:eastAsia="Arial" w:hAnsi="Arial" w:cs="Arial"/>
@@ -2658,6 +2789,7 @@
         <w:t>Amen.</w:t>
       </w:r>
     </w:p>
+    <w:bookmarkEnd w:id="10"/>
     <w:p>
       <w:pPr>
         <w:shd w:val="clear" w:color="auto" w:fill="FFFFFF"/>
@@ -3647,6 +3779,7 @@
           <w:color w:val="000000"/>
         </w:rPr>
       </w:pPr>
+      <w:bookmarkStart w:id="11" w:name="_Hlk230688097"/>
       <w:r>
         <w:rPr>
           <w:rFonts w:ascii="Arial" w:eastAsia="Arial" w:hAnsi="Arial" w:cs="Arial"/>
@@ -3822,6 +3955,7 @@
         </w:rPr>
         <w:t>Beati voi quando vi insulteranno, vi perseguiteranno e, mentendo, diranno ogni sorta di male contro di voi per causa mia. Rallegratevi ed esultate, perché grande è la vostra ricompensa nei cieli. Così infatti hanno perseguitato i profeti prima di voi.</w:t>
       </w:r>
+      <w:bookmarkEnd w:id="11"/>
     </w:p>
     <w:p>
       <w:pPr>
@@ -4258,8 +4392,17 @@
           <w:rFonts w:ascii="Arial" w:eastAsia="Arial" w:hAnsi="Arial" w:cs="Arial"/>
           <w:color w:val="0A0A0A"/>
         </w:rPr>
-        <w:t> Il Signore benedica i vostri cuori perché siano pronti all'ascolto. Benedica le vostre parole perché siano eco della sua Parola. Vi conceda una notte serena e un risveglio pronti a servirlo.</w:t>
-      </w:r>
+        <w:t> </w:t>
+      </w:r>
+      <w:bookmarkStart w:id="12" w:name="_Hlk230688263"/>
+      <w:r>
+        <w:rPr>
+          <w:rFonts w:ascii="Arial" w:eastAsia="Arial" w:hAnsi="Arial" w:cs="Arial"/>
+          <w:color w:val="0A0A0A"/>
+        </w:rPr>
+        <w:t>Il Signore benedica i vostri cuori perché siano pronti all'ascolto. Benedica le vostre parole perché siano eco della sua Parola. Vi conceda una notte serena e un risveglio pronti a servirlo.</w:t>
+      </w:r>
+      <w:bookmarkEnd w:id="12"/>
       <w:r>
         <w:rPr>
           <w:rFonts w:ascii="Arial" w:eastAsia="Arial" w:hAnsi="Arial" w:cs="Arial"/>
@@ -4636,8 +4779,18 @@
           <w:color w:val="0A0A0A"/>
           <w:highlight w:val="white"/>
         </w:rPr>
-        <w:t>: Buongiorno! Dopo i primi giorni di campo, la tentazione è quella di pensare già alla fine o di lasciarsi trascinare dalla stanchezza. Ma oggi la parola d'ordine è 'restare'. Restare nel gioco anche quando si perde, restare amici anche quando si discute, restare con Gesù anche quando non sentiamo 'i fuochi d'artificio'. Rimanere è l'unico modo per mettere radici profonde. Amen.</w:t>
-      </w:r>
+        <w:t xml:space="preserve">: </w:t>
+      </w:r>
+      <w:bookmarkStart w:id="13" w:name="OLE_LINK7"/>
+      <w:r>
+        <w:rPr>
+          <w:rFonts w:ascii="Arial" w:eastAsia="Arial" w:hAnsi="Arial" w:cs="Arial"/>
+          <w:color w:val="0A0A0A"/>
+          <w:highlight w:val="white"/>
+        </w:rPr>
+        <w:t>Buongiorno! Dopo i primi giorni di campo, la tentazione è quella di pensare già alla fine o di lasciarsi trascinare dalla stanchezza. Ma oggi la parola d'ordine è 'restare'. Restare nel gioco anche quando si perde, restare amici anche quando si discute, restare con Gesù anche quando non sentiamo 'i fuochi d'artificio'. Rimanere è l'unico modo per mettere radici profonde. Amen.</w:t>
+      </w:r>
+      <w:bookmarkEnd w:id="13"/>
     </w:p>
     <w:p>
       <w:pPr>
@@ -4715,6 +4868,7 @@
           <w:color w:val="0A0A0A"/>
         </w:rPr>
       </w:pPr>
+      <w:bookmarkStart w:id="14" w:name="OLE_LINK8"/>
       <w:r>
         <w:rPr>
           <w:rFonts w:ascii="Arial" w:eastAsia="Arial" w:hAnsi="Arial" w:cs="Arial"/>
@@ -5215,6 +5369,7 @@
           <w:rFonts w:ascii="Arial" w:eastAsia="Arial" w:hAnsi="Arial" w:cs="Arial"/>
           <w:color w:val="0A0A0A"/>
         </w:rPr>
+        <w:lastRenderedPageBreak/>
         <w:t>perché il tuo piede non inciampi nella pietra.</w:t>
       </w:r>
     </w:p>
@@ -5403,10 +5558,7 @@
           <w:type w:val="continuous"/>
           <w:pgSz w:w="11906" w:h="16838"/>
           <w:pgMar w:top="1417" w:right="1134" w:bottom="1134" w:left="1134" w:header="708" w:footer="708" w:gutter="0"/>
-          <w:cols w:num="2" w:space="720" w:equalWidth="0">
-            <w:col w:w="4458" w:space="720"/>
-            <w:col w:w="4458" w:space="0"/>
-          </w:cols>
+          <w:cols w:space="720"/>
         </w:sectPr>
       </w:pPr>
       <w:r>
@@ -5417,6 +5569,7 @@
         <w:t>e gli farò vedere la mia salvezza”.</w:t>
       </w:r>
     </w:p>
+    <w:bookmarkEnd w:id="14"/>
     <w:p>
       <w:pPr>
         <w:pBdr>
@@ -5568,7 +5721,6 @@
           <w:color w:val="0A0A0A"/>
           <w:highlight w:val="white"/>
         </w:rPr>
-        <w:lastRenderedPageBreak/>
         <w:t>Preghiera Corale</w:t>
       </w:r>
     </w:p>
@@ -11098,7 +11250,7 @@
 </file>
 
 <file path=word/endnotes.xml><?xml version="1.0" encoding="utf-8"?>
-<w:endnotes xmlns:wpc="http://schemas.microsoft.com/office/word/2010/wordprocessingCanvas" xmlns:cx="http://schemas.microsoft.com/office/drawing/2014/chartex" xmlns:cx1="http://schemas.microsoft.com/office/drawing/2015/9/8/chartex" xmlns:cx2="http://schemas.microsoft.com/office/drawing/2015/10/21/chartex" xmlns:cx3="http://schemas.microsoft.com/office/drawing/2016/5/9/chartex" xmlns:cx4="http://schemas.microsoft.com/office/drawing/2016/5/10/chartex" xmlns:cx5="http://schemas.microsoft.com/office/drawing/2016/5/11/chartex" xmlns:cx6="http://schemas.microsoft.com/office/drawing/2016/5/12/chartex" xmlns:cx7="http://schemas.microsoft.com/office/drawing/2016/5/13/chartex" xmlns:cx8="http://schemas.microsoft.com/office/drawing/2016/5/14/chartex" xmlns:mc="http://schemas.openxmlformats.org/markup-compatibility/2006" xmlns:aink="http://schemas.microsoft.com/office/drawing/2016/ink" xmlns:am3d="http://schemas.microsoft.com/office/drawing/2017/model3d" xmlns:o="urn:schemas-microsoft-com:office:office" xmlns:oel="http://schemas.microsoft.com/office/2019/extlst" xmlns:r="http://schemas.openxmlformats.org/officeDocument/2006/relationships" xmlns:m="http://schemas.openxmlformats.org/officeDocument/2006/math" xmlns:v="urn:schemas-microsoft-com:vml" xmlns:wp14="http://schemas.microsoft.com/office/word/2010/wordprocessingDrawing" xmlns:wp="http://schemas.openxmlformats.org/drawingml/2006/wordprocessingDrawing" xmlns:w10="urn:schemas-microsoft-com:office:word" xmlns:w="http://schemas.openxmlformats.org/wordprocessingml/2006/main" xmlns:w14="http://schemas.microsoft.com/office/word/2010/wordml" xmlns:w15="http://schemas.microsoft.com/office/word/2012/wordml" xmlns:w16cex="http://schemas.microsoft.com/office/word/2018/wordml/cex" xmlns:w16cid="http://schemas.microsoft.com/office/word/2016/wordml/cid" xmlns:w16="http://schemas.microsoft.com/office/word/2018/wordml" xmlns:w16sdtdh="http://schemas.microsoft.com/office/word/2020/wordml/sdtdatahash" xmlns:w16se="http://schemas.microsoft.com/office/word/2015/wordml/symex" xmlns:wpg="http://schemas.microsoft.com/office/word/2010/wordprocessingGroup" xmlns:wpi="http://schemas.microsoft.com/office/word/2010/wordprocessingInk" xmlns:wne="http://schemas.microsoft.com/office/word/2006/wordml" xmlns:wps="http://schemas.microsoft.com/office/word/2010/wordprocessingShape" mc:Ignorable="w14 w15 w16se w16cid w16 w16cex w16sdtdh wp14">
+<w:endnotes xmlns:wpc="http://schemas.microsoft.com/office/word/2010/wordprocessingCanvas" xmlns:cx="http://schemas.microsoft.com/office/drawing/2014/chartex" xmlns:cx1="http://schemas.microsoft.com/office/drawing/2015/9/8/chartex" xmlns:cx2="http://schemas.microsoft.com/office/drawing/2015/10/21/chartex" xmlns:cx3="http://schemas.microsoft.com/office/drawing/2016/5/9/chartex" xmlns:cx4="http://schemas.microsoft.com/office/drawing/2016/5/10/chartex" xmlns:cx5="http://schemas.microsoft.com/office/drawing/2016/5/11/chartex" xmlns:cx6="http://schemas.microsoft.com/office/drawing/2016/5/12/chartex" xmlns:cx7="http://schemas.microsoft.com/office/drawing/2016/5/13/chartex" xmlns:cx8="http://schemas.microsoft.com/office/drawing/2016/5/14/chartex" xmlns:mc="http://schemas.openxmlformats.org/markup-compatibility/2006" xmlns:m="http://schemas.openxmlformats.org/officeDocument/2006/math" xmlns:aink="http://schemas.microsoft.com/office/drawing/2016/ink" xmlns:am3d="http://schemas.microsoft.com/office/drawing/2017/model3d" xmlns:oel="http://schemas.microsoft.com/office/2019/extlst" xmlns:r="http://schemas.openxmlformats.org/officeDocument/2006/relationships" xmlns:wp14="http://schemas.microsoft.com/office/word/2010/wordprocessingDrawing" xmlns:wp="http://schemas.openxmlformats.org/drawingml/2006/wordprocessingDrawing" xmlns:wpg="http://schemas.microsoft.com/office/word/2010/wordprocessingGroup" xmlns:wpi="http://schemas.microsoft.com/office/word/2010/wordprocessingInk" xmlns:wps="http://schemas.microsoft.com/office/word/2010/wordprocessingShape" xmlns:o="urn:schemas-microsoft-com:office:office" xmlns:v="urn:schemas-microsoft-com:vml" xmlns:w10="urn:schemas-microsoft-com:office:word" xmlns:w="http://schemas.openxmlformats.org/wordprocessingml/2006/main" xmlns:w14="http://schemas.microsoft.com/office/word/2010/wordml" xmlns:w15="http://schemas.microsoft.com/office/word/2012/wordml" xmlns:w16cei="http://schemas.microsoft.com/office/word/2026/wordml/cei" xmlns:w16cex="http://schemas.microsoft.com/office/word/2018/wordml/cex" xmlns:w16cid="http://schemas.microsoft.com/office/word/2016/wordml/cid" xmlns:w16="http://schemas.microsoft.com/office/word/2018/wordml" xmlns:w16sdtdh="http://schemas.microsoft.com/office/word/2020/wordml/sdtdatahash" xmlns:w16sdtfl="http://schemas.microsoft.com/office/word/2024/wordml/sdtformatlock" xmlns:w16se="http://schemas.microsoft.com/office/word/2015/wordml/symex" xmlns:w16du="http://schemas.microsoft.com/office/word/2023/wordml/word16du" xmlns:wne="http://schemas.microsoft.com/office/word/2006/wordml" mc:Ignorable="w14 w15 w16se w16cid w16 w16cex w16sdtdh w16sdtfl w16du wp14">
   <w:endnote w:type="separator" w:id="-1">
     <w:p>
       <w:pPr>
@@ -11123,7 +11275,7 @@
 </file>
 
 <file path=word/footnotes.xml><?xml version="1.0" encoding="utf-8"?>
-<w:footnotes xmlns:wpc="http://schemas.microsoft.com/office/word/2010/wordprocessingCanvas" xmlns:cx="http://schemas.microsoft.com/office/drawing/2014/chartex" xmlns:cx1="http://schemas.microsoft.com/office/drawing/2015/9/8/chartex" xmlns:cx2="http://schemas.microsoft.com/office/drawing/2015/10/21/chartex" xmlns:cx3="http://schemas.microsoft.com/office/drawing/2016/5/9/chartex" xmlns:cx4="http://schemas.microsoft.com/office/drawing/2016/5/10/chartex" xmlns:cx5="http://schemas.microsoft.com/office/drawing/2016/5/11/chartex" xmlns:cx6="http://schemas.microsoft.com/office/drawing/2016/5/12/chartex" xmlns:cx7="http://schemas.microsoft.com/office/drawing/2016/5/13/chartex" xmlns:cx8="http://schemas.microsoft.com/office/drawing/2016/5/14/chartex" xmlns:mc="http://schemas.openxmlformats.org/markup-compatibility/2006" xmlns:aink="http://schemas.microsoft.com/office/drawing/2016/ink" xmlns:am3d="http://schemas.microsoft.com/office/drawing/2017/model3d" xmlns:o="urn:schemas-microsoft-com:office:office" xmlns:oel="http://schemas.microsoft.com/office/2019/extlst" xmlns:r="http://schemas.openxmlformats.org/officeDocument/2006/relationships" xmlns:m="http://schemas.openxmlformats.org/officeDocument/2006/math" xmlns:v="urn:schemas-microsoft-com:vml" xmlns:wp14="http://schemas.microsoft.com/office/word/2010/wordprocessingDrawing" xmlns:wp="http://schemas.openxmlformats.org/drawingml/2006/wordprocessingDrawing" xmlns:w10="urn:schemas-microsoft-com:office:word" xmlns:w="http://schemas.openxmlformats.org/wordprocessingml/2006/main" xmlns:w14="http://schemas.microsoft.com/office/word/2010/wordml" xmlns:w15="http://schemas.microsoft.com/office/word/2012/wordml" xmlns:w16cex="http://schemas.microsoft.com/office/word/2018/wordml/cex" xmlns:w16cid="http://schemas.microsoft.com/office/word/2016/wordml/cid" xmlns:w16="http://schemas.microsoft.com/office/word/2018/wordml" xmlns:w16sdtdh="http://schemas.microsoft.com/office/word/2020/wordml/sdtdatahash" xmlns:w16se="http://schemas.microsoft.com/office/word/2015/wordml/symex" xmlns:wpg="http://schemas.microsoft.com/office/word/2010/wordprocessingGroup" xmlns:wpi="http://schemas.microsoft.com/office/word/2010/wordprocessingInk" xmlns:wne="http://schemas.microsoft.com/office/word/2006/wordml" xmlns:wps="http://schemas.microsoft.com/office/word/2010/wordprocessingShape" mc:Ignorable="w14 w15 w16se w16cid w16 w16cex w16sdtdh wp14">
+<w:footnotes xmlns:wpc="http://schemas.microsoft.com/office/word/2010/wordprocessingCanvas" xmlns:cx="http://schemas.microsoft.com/office/drawing/2014/chartex" xmlns:cx1="http://schemas.microsoft.com/office/drawing/2015/9/8/chartex" xmlns:cx2="http://schemas.microsoft.com/office/drawing/2015/10/21/chartex" xmlns:cx3="http://schemas.microsoft.com/office/drawing/2016/5/9/chartex" xmlns:cx4="http://schemas.microsoft.com/office/drawing/2016/5/10/chartex" xmlns:cx5="http://schemas.microsoft.com/office/drawing/2016/5/11/chartex" xmlns:cx6="http://schemas.microsoft.com/office/drawing/2016/5/12/chartex" xmlns:cx7="http://schemas.microsoft.com/office/drawing/2016/5/13/chartex" xmlns:cx8="http://schemas.microsoft.com/office/drawing/2016/5/14/chartex" xmlns:mc="http://schemas.openxmlformats.org/markup-compatibility/2006" xmlns:m="http://schemas.openxmlformats.org/officeDocument/2006/math" xmlns:aink="http://schemas.microsoft.com/office/drawing/2016/ink" xmlns:am3d="http://schemas.microsoft.com/office/drawing/2017/model3d" xmlns:oel="http://schemas.microsoft.com/office/2019/extlst" xmlns:r="http://schemas.openxmlformats.org/officeDocument/2006/relationships" xmlns:wp14="http://schemas.microsoft.com/office/word/2010/wordprocessingDrawing" xmlns:wp="http://schemas.openxmlformats.org/drawingml/2006/wordprocessingDrawing" xmlns:wpg="http://schemas.microsoft.com/office/word/2010/wordprocessingGroup" xmlns:wpi="http://schemas.microsoft.com/office/word/2010/wordprocessingInk" xmlns:wps="http://schemas.microsoft.com/office/word/2010/wordprocessingShape" xmlns:o="urn:schemas-microsoft-com:office:office" xmlns:v="urn:schemas-microsoft-com:vml" xmlns:w10="urn:schemas-microsoft-com:office:word" xmlns:w="http://schemas.openxmlformats.org/wordprocessingml/2006/main" xmlns:w14="http://schemas.microsoft.com/office/word/2010/wordml" xmlns:w15="http://schemas.microsoft.com/office/word/2012/wordml" xmlns:w16cei="http://schemas.microsoft.com/office/word/2026/wordml/cei" xmlns:w16cex="http://schemas.microsoft.com/office/word/2018/wordml/cex" xmlns:w16cid="http://schemas.microsoft.com/office/word/2016/wordml/cid" xmlns:w16="http://schemas.microsoft.com/office/word/2018/wordml" xmlns:w16sdtdh="http://schemas.microsoft.com/office/word/2020/wordml/sdtdatahash" xmlns:w16sdtfl="http://schemas.microsoft.com/office/word/2024/wordml/sdtformatlock" xmlns:w16se="http://schemas.microsoft.com/office/word/2015/wordml/symex" xmlns:w16du="http://schemas.microsoft.com/office/word/2023/wordml/word16du" xmlns:wne="http://schemas.microsoft.com/office/word/2006/wordml" mc:Ignorable="w14 w15 w16se w16cid w16 w16cex w16sdtdh w16sdtfl w16du wp14">
   <w:footnote w:type="separator" w:id="-1">
     <w:p>
       <w:pPr>
@@ -11148,7 +11300,7 @@
 </file>
 
 <file path=word/numbering.xml><?xml version="1.0" encoding="utf-8"?>
-<w:numbering xmlns:wpc="http://schemas.microsoft.com/office/word/2010/wordprocessingCanvas" xmlns:cx="http://schemas.microsoft.com/office/drawing/2014/chartex" xmlns:cx1="http://schemas.microsoft.com/office/drawing/2015/9/8/chartex" xmlns:cx2="http://schemas.microsoft.com/office/drawing/2015/10/21/chartex" xmlns:cx3="http://schemas.microsoft.com/office/drawing/2016/5/9/chartex" xmlns:cx4="http://schemas.microsoft.com/office/drawing/2016/5/10/chartex" xmlns:cx5="http://schemas.microsoft.com/office/drawing/2016/5/11/chartex" xmlns:cx6="http://schemas.microsoft.com/office/drawing/2016/5/12/chartex" xmlns:cx7="http://schemas.microsoft.com/office/drawing/2016/5/13/chartex" xmlns:cx8="http://schemas.microsoft.com/office/drawing/2016/5/14/chartex" xmlns:mc="http://schemas.openxmlformats.org/markup-compatibility/2006" xmlns:aink="http://schemas.microsoft.com/office/drawing/2016/ink" xmlns:am3d="http://schemas.microsoft.com/office/drawing/2017/model3d" xmlns:o="urn:schemas-microsoft-com:office:office" xmlns:oel="http://schemas.microsoft.com/office/2019/extlst" xmlns:r="http://schemas.openxmlformats.org/officeDocument/2006/relationships" xmlns:m="http://schemas.openxmlformats.org/officeDocument/2006/math" xmlns:v="urn:schemas-microsoft-com:vml" xmlns:wp14="http://schemas.microsoft.com/office/word/2010/wordprocessingDrawing" xmlns:wp="http://schemas.openxmlformats.org/drawingml/2006/wordprocessingDrawing" xmlns:w10="urn:schemas-microsoft-com:office:word" xmlns:w="http://schemas.openxmlformats.org/wordprocessingml/2006/main" xmlns:w14="http://schemas.microsoft.com/office/word/2010/wordml" xmlns:w15="http://schemas.microsoft.com/office/word/2012/wordml" xmlns:w16cex="http://schemas.microsoft.com/office/word/2018/wordml/cex" xmlns:w16cid="http://schemas.microsoft.com/office/word/2016/wordml/cid" xmlns:w16="http://schemas.microsoft.com/office/word/2018/wordml" xmlns:w16sdtdh="http://schemas.microsoft.com/office/word/2020/wordml/sdtdatahash" xmlns:w16se="http://schemas.microsoft.com/office/word/2015/wordml/symex" xmlns:wpg="http://schemas.microsoft.com/office/word/2010/wordprocessingGroup" xmlns:wpi="http://schemas.microsoft.com/office/word/2010/wordprocessingInk" xmlns:wne="http://schemas.microsoft.com/office/word/2006/wordml" xmlns:wps="http://schemas.microsoft.com/office/word/2010/wordprocessingShape" mc:Ignorable="w14 w15 w16se w16cid w16 w16cex w16sdtdh wp14">
+<w:numbering xmlns:wpc="http://schemas.microsoft.com/office/word/2010/wordprocessingCanvas" xmlns:cx="http://schemas.microsoft.com/office/drawing/2014/chartex" xmlns:cx1="http://schemas.microsoft.com/office/drawing/2015/9/8/chartex" xmlns:cx2="http://schemas.microsoft.com/office/drawing/2015/10/21/chartex" xmlns:cx3="http://schemas.microsoft.com/office/drawing/2016/5/9/chartex" xmlns:cx4="http://schemas.microsoft.com/office/drawing/2016/5/10/chartex" xmlns:cx5="http://schemas.microsoft.com/office/drawing/2016/5/11/chartex" xmlns:cx6="http://schemas.microsoft.com/office/drawing/2016/5/12/chartex" xmlns:cx7="http://schemas.microsoft.com/office/drawing/2016/5/13/chartex" xmlns:cx8="http://schemas.microsoft.com/office/drawing/2016/5/14/chartex" xmlns:mc="http://schemas.openxmlformats.org/markup-compatibility/2006" xmlns:m="http://schemas.openxmlformats.org/officeDocument/2006/math" xmlns:aink="http://schemas.microsoft.com/office/drawing/2016/ink" xmlns:am3d="http://schemas.microsoft.com/office/drawing/2017/model3d" xmlns:oel="http://schemas.microsoft.com/office/2019/extlst" xmlns:r="http://schemas.openxmlformats.org/officeDocument/2006/relationships" xmlns:wp14="http://schemas.microsoft.com/office/word/2010/wordprocessingDrawing" xmlns:wp="http://schemas.openxmlformats.org/drawingml/2006/wordprocessingDrawing" xmlns:wpg="http://schemas.microsoft.com/office/word/2010/wordprocessingGroup" xmlns:wpi="http://schemas.microsoft.com/office/word/2010/wordprocessingInk" xmlns:wps="http://schemas.microsoft.com/office/word/2010/wordprocessingShape" xmlns:o="urn:schemas-microsoft-com:office:office" xmlns:v="urn:schemas-microsoft-com:vml" xmlns:w10="urn:schemas-microsoft-com:office:word" xmlns:w="http://schemas.openxmlformats.org/wordprocessingml/2006/main" xmlns:w14="http://schemas.microsoft.com/office/word/2010/wordml" xmlns:w15="http://schemas.microsoft.com/office/word/2012/wordml" xmlns:w16cei="http://schemas.microsoft.com/office/word/2026/wordml/cei" xmlns:w16cex="http://schemas.microsoft.com/office/word/2018/wordml/cex" xmlns:w16cid="http://schemas.microsoft.com/office/word/2016/wordml/cid" xmlns:w16="http://schemas.microsoft.com/office/word/2018/wordml" xmlns:w16sdtdh="http://schemas.microsoft.com/office/word/2020/wordml/sdtdatahash" xmlns:w16sdtfl="http://schemas.microsoft.com/office/word/2024/wordml/sdtformatlock" xmlns:w16se="http://schemas.microsoft.com/office/word/2015/wordml/symex" xmlns:w16du="http://schemas.microsoft.com/office/word/2023/wordml/word16du" xmlns:wne="http://schemas.microsoft.com/office/word/2006/wordml" mc:Ignorable="w14 w15 w16se w16cid w16 w16cex w16sdtdh w16sdtfl w16du wp14">
   <w:abstractNum w:abstractNumId="0" w15:restartNumberingAfterBreak="0">
     <w:nsid w:val="190A4F97"/>
     <w:multiLevelType w:val="hybridMultilevel"/>
@@ -11471,7 +11623,7 @@
 </file>
 
 <file path=word/styles.xml><?xml version="1.0" encoding="utf-8"?>
-<w:styles xmlns:mc="http://schemas.openxmlformats.org/markup-compatibility/2006" xmlns:r="http://schemas.openxmlformats.org/officeDocument/2006/relationships" xmlns:w="http://schemas.openxmlformats.org/wordprocessingml/2006/main" xmlns:w14="http://schemas.microsoft.com/office/word/2010/wordml" xmlns:w15="http://schemas.microsoft.com/office/word/2012/wordml" xmlns:w16cex="http://schemas.microsoft.com/office/word/2018/wordml/cex" xmlns:w16cid="http://schemas.microsoft.com/office/word/2016/wordml/cid" xmlns:w16="http://schemas.microsoft.com/office/word/2018/wordml" xmlns:w16sdtdh="http://schemas.microsoft.com/office/word/2020/wordml/sdtdatahash" xmlns:w16se="http://schemas.microsoft.com/office/word/2015/wordml/symex" mc:Ignorable="w14 w15 w16se w16cid w16 w16cex w16sdtdh">
+<w:styles xmlns:mc="http://schemas.openxmlformats.org/markup-compatibility/2006" xmlns:r="http://schemas.openxmlformats.org/officeDocument/2006/relationships" xmlns:w="http://schemas.openxmlformats.org/wordprocessingml/2006/main" xmlns:w14="http://schemas.microsoft.com/office/word/2010/wordml" xmlns:w15="http://schemas.microsoft.com/office/word/2012/wordml" xmlns:w16cex="http://schemas.microsoft.com/office/word/2018/wordml/cex" xmlns:w16cid="http://schemas.microsoft.com/office/word/2016/wordml/cid" xmlns:w16="http://schemas.microsoft.com/office/word/2018/wordml" xmlns:w16sdtdh="http://schemas.microsoft.com/office/word/2020/wordml/sdtdatahash" xmlns:w16sdtfl="http://schemas.microsoft.com/office/word/2024/wordml/sdtformatlock" xmlns:w16se="http://schemas.microsoft.com/office/word/2015/wordml/symex" xmlns:w16du="http://schemas.microsoft.com/office/word/2023/wordml/word16du" mc:Ignorable="w14 w15 w16se w16cid w16 w16cex w16sdtdh w16sdtfl w16du">
   <w:docDefaults>
     <w:rPrDefault>
       <w:rPr>
@@ -12727,4 +12879,16 @@
     </a:ext>
   </a:extLst>
 </a:theme>
+</file>
+
+<file path=customXml/item1.xml><?xml version="1.0" encoding="utf-8"?>
+<b:Sources xmlns:b="http://schemas.openxmlformats.org/officeDocument/2006/bibliography" xmlns="http://schemas.openxmlformats.org/officeDocument/2006/bibliography" SelectedStyle="/APASixthEditionOfficeOnline.xsl" StyleName="APA" Version="6"/>
+</file>
+
+<file path=customXml/itemProps1.xml><?xml version="1.0" encoding="utf-8"?>
+<ds:datastoreItem xmlns:ds="http://schemas.openxmlformats.org/officeDocument/2006/customXml" ds:itemID="{C57937D9-72D5-3044-89CD-7AC52AAA60BF}">
+  <ds:schemaRefs>
+    <ds:schemaRef ds:uri="http://schemas.openxmlformats.org/officeDocument/2006/bibliography"/>
+  </ds:schemaRefs>
+</ds:datastoreItem>
 </file>
</xml_diff>